<commit_message>
Apache HTTPD 설치 문서 보완
</commit_message>
<xml_diff>
--- a/docs/tech/ezEmail/Apache HTTPD 설치 및 톰캣 로드밸런싱.docx
+++ b/docs/tech/ezEmail/Apache HTTPD 설치 및 톰캣 로드밸런싱.docx
@@ -1778,8 +1778,6 @@
             <w:fldChar w:fldCharType="end"/>
           </w:r>
         </w:p>
-        <w:bookmarkStart w:id="5" w:name="_GoBack" w:displacedByCustomXml="next"/>
-        <w:bookmarkEnd w:id="5" w:displacedByCustomXml="next"/>
       </w:sdtContent>
     </w:sdt>
     <w:p/>
@@ -1790,45 +1788,45 @@
         <w:ind w:right="200"/>
       </w:pPr>
     </w:p>
-    <w:bookmarkStart w:id="6" w:name="_Toc342675505"/>
-    <w:bookmarkStart w:id="7" w:name="_Toc342676083"/>
-    <w:bookmarkStart w:id="8" w:name="_Toc342761306"/>
-    <w:bookmarkStart w:id="9" w:name="_Toc342761725"/>
-    <w:bookmarkStart w:id="10" w:name="_Toc342783495"/>
-    <w:bookmarkStart w:id="11" w:name="_Toc342795045"/>
-    <w:bookmarkStart w:id="12" w:name="_Toc342826207"/>
-    <w:bookmarkStart w:id="13" w:name="_Toc342846194"/>
-    <w:bookmarkStart w:id="14" w:name="_Toc342847751"/>
-    <w:bookmarkStart w:id="15" w:name="_Toc342848266"/>
-    <w:bookmarkStart w:id="16" w:name="_Toc342848749"/>
-    <w:bookmarkStart w:id="17" w:name="_Toc342851651"/>
-    <w:bookmarkStart w:id="18" w:name="_Toc342852174"/>
-    <w:bookmarkStart w:id="19" w:name="_Toc342853691"/>
-    <w:bookmarkStart w:id="20" w:name="_Toc342855549"/>
-    <w:bookmarkStart w:id="21" w:name="_Toc342856015"/>
-    <w:bookmarkStart w:id="22" w:name="_Toc342895750"/>
-    <w:bookmarkStart w:id="23" w:name="_Toc342896742"/>
-    <w:bookmarkStart w:id="24" w:name="_Toc342897536"/>
-    <w:bookmarkStart w:id="25" w:name="_Toc342898754"/>
-    <w:bookmarkStart w:id="26" w:name="_Toc342899215"/>
-    <w:bookmarkStart w:id="27" w:name="_Toc342899663"/>
-    <w:bookmarkStart w:id="28" w:name="_Toc342900145"/>
-    <w:bookmarkStart w:id="29" w:name="_Toc342901829"/>
-    <w:bookmarkStart w:id="30" w:name="_Toc342903504"/>
-    <w:bookmarkStart w:id="31" w:name="_Toc342909753"/>
-    <w:bookmarkStart w:id="32" w:name="_Toc342910263"/>
-    <w:bookmarkStart w:id="33" w:name="_Toc342910773"/>
-    <w:bookmarkStart w:id="34" w:name="_Toc342911283"/>
-    <w:bookmarkStart w:id="35" w:name="_Toc342911794"/>
-    <w:bookmarkStart w:id="36" w:name="_Toc342912303"/>
-    <w:bookmarkStart w:id="37" w:name="_Toc342914474"/>
-    <w:bookmarkStart w:id="38" w:name="_Toc342915993"/>
-    <w:bookmarkStart w:id="39" w:name="_Toc342917571"/>
-    <w:bookmarkStart w:id="40" w:name="_Toc342926126"/>
-    <w:bookmarkStart w:id="41" w:name="_Toc488328257"/>
-    <w:bookmarkStart w:id="42" w:name="_Toc488328292"/>
-    <w:bookmarkStart w:id="43" w:name="_Toc496545301"/>
-    <w:bookmarkStart w:id="44" w:name="_Toc27988213"/>
+    <w:bookmarkStart w:id="5" w:name="_Toc342675505"/>
+    <w:bookmarkStart w:id="6" w:name="_Toc342676083"/>
+    <w:bookmarkStart w:id="7" w:name="_Toc342761306"/>
+    <w:bookmarkStart w:id="8" w:name="_Toc342761725"/>
+    <w:bookmarkStart w:id="9" w:name="_Toc342783495"/>
+    <w:bookmarkStart w:id="10" w:name="_Toc342795045"/>
+    <w:bookmarkStart w:id="11" w:name="_Toc342826207"/>
+    <w:bookmarkStart w:id="12" w:name="_Toc342846194"/>
+    <w:bookmarkStart w:id="13" w:name="_Toc342847751"/>
+    <w:bookmarkStart w:id="14" w:name="_Toc342848266"/>
+    <w:bookmarkStart w:id="15" w:name="_Toc342848749"/>
+    <w:bookmarkStart w:id="16" w:name="_Toc342851651"/>
+    <w:bookmarkStart w:id="17" w:name="_Toc342852174"/>
+    <w:bookmarkStart w:id="18" w:name="_Toc342853691"/>
+    <w:bookmarkStart w:id="19" w:name="_Toc342855549"/>
+    <w:bookmarkStart w:id="20" w:name="_Toc342856015"/>
+    <w:bookmarkStart w:id="21" w:name="_Toc342895750"/>
+    <w:bookmarkStart w:id="22" w:name="_Toc342896742"/>
+    <w:bookmarkStart w:id="23" w:name="_Toc342897536"/>
+    <w:bookmarkStart w:id="24" w:name="_Toc342898754"/>
+    <w:bookmarkStart w:id="25" w:name="_Toc342899215"/>
+    <w:bookmarkStart w:id="26" w:name="_Toc342899663"/>
+    <w:bookmarkStart w:id="27" w:name="_Toc342900145"/>
+    <w:bookmarkStart w:id="28" w:name="_Toc342901829"/>
+    <w:bookmarkStart w:id="29" w:name="_Toc342903504"/>
+    <w:bookmarkStart w:id="30" w:name="_Toc342909753"/>
+    <w:bookmarkStart w:id="31" w:name="_Toc342910263"/>
+    <w:bookmarkStart w:id="32" w:name="_Toc342910773"/>
+    <w:bookmarkStart w:id="33" w:name="_Toc342911283"/>
+    <w:bookmarkStart w:id="34" w:name="_Toc342911794"/>
+    <w:bookmarkStart w:id="35" w:name="_Toc342912303"/>
+    <w:bookmarkStart w:id="36" w:name="_Toc342914474"/>
+    <w:bookmarkStart w:id="37" w:name="_Toc342915993"/>
+    <w:bookmarkStart w:id="38" w:name="_Toc342917571"/>
+    <w:bookmarkStart w:id="39" w:name="_Toc342926126"/>
+    <w:bookmarkStart w:id="40" w:name="_Toc488328257"/>
+    <w:bookmarkStart w:id="41" w:name="_Toc488328292"/>
+    <w:bookmarkStart w:id="42" w:name="_Toc496545301"/>
+    <w:bookmarkStart w:id="43" w:name="_Toc27988213"/>
     <w:p>
       <w:pPr>
         <w:pStyle w:val="ae"/>
@@ -1937,6 +1935,7 @@
           </mc:Fallback>
         </mc:AlternateContent>
       </w:r>
+      <w:bookmarkEnd w:id="5"/>
       <w:bookmarkEnd w:id="6"/>
       <w:bookmarkEnd w:id="7"/>
       <w:bookmarkEnd w:id="8"/>
@@ -1975,7 +1974,6 @@
       <w:bookmarkEnd w:id="41"/>
       <w:bookmarkEnd w:id="42"/>
       <w:bookmarkEnd w:id="43"/>
-      <w:bookmarkEnd w:id="44"/>
     </w:p>
     <w:p>
       <w:pPr>
@@ -1986,7 +1984,7 @@
         </w:numPr>
         <w:ind w:left="200" w:right="200"/>
       </w:pPr>
-      <w:bookmarkStart w:id="45" w:name="_Toc28005350"/>
+      <w:bookmarkStart w:id="44" w:name="_Toc28005350"/>
       <w:r>
         <w:t>Apache HTTPD</w:t>
       </w:r>
@@ -2002,7 +2000,7 @@
         </w:rPr>
         <w:t>설치</w:t>
       </w:r>
-      <w:bookmarkEnd w:id="45"/>
+      <w:bookmarkEnd w:id="44"/>
     </w:p>
     <w:p>
       <w:pPr>
@@ -2118,891 +2116,14 @@
     </w:p>
     <w:p>
       <w:pPr>
-        <w:pStyle w:val="ac"/>
-      </w:pPr>
-      <w:r>
-        <w:rPr>
-          <w:rFonts w:ascii="Verdana" w:eastAsia="굴림" w:hAnsi="Verdana" w:cs="굴림"/>
-          <w:color w:val="333333"/>
-          <w:kern w:val="0"/>
-          <w:sz w:val="18"/>
-          <w:szCs w:val="18"/>
-        </w:rPr>
-        <w:lastRenderedPageBreak/>
-        <w:t>CentOS7</w:t>
-      </w:r>
-      <w:r>
-        <w:rPr>
-          <w:rFonts w:ascii="Verdana" w:eastAsia="굴림" w:hAnsi="Verdana" w:cs="굴림"/>
-          <w:color w:val="333333"/>
-          <w:kern w:val="0"/>
-          <w:sz w:val="18"/>
-          <w:szCs w:val="18"/>
-        </w:rPr>
-        <w:t>이</w:t>
-      </w:r>
-      <w:r>
-        <w:rPr>
-          <w:rFonts w:ascii="Verdana" w:eastAsia="굴림" w:hAnsi="Verdana" w:cs="굴림"/>
-          <w:color w:val="333333"/>
-          <w:kern w:val="0"/>
-          <w:sz w:val="18"/>
-          <w:szCs w:val="18"/>
-        </w:rPr>
-        <w:t xml:space="preserve"> </w:t>
-      </w:r>
-      <w:r>
-        <w:rPr>
-          <w:rFonts w:ascii="Verdana" w:eastAsia="굴림" w:hAnsi="Verdana" w:cs="굴림"/>
-          <w:color w:val="333333"/>
-          <w:kern w:val="0"/>
-          <w:sz w:val="18"/>
-          <w:szCs w:val="18"/>
-        </w:rPr>
-        <w:t>설치되었고</w:t>
-      </w:r>
-      <w:r>
-        <w:rPr>
-          <w:rFonts w:ascii="Verdana" w:eastAsia="굴림" w:hAnsi="Verdana" w:cs="굴림"/>
-          <w:color w:val="333333"/>
-          <w:kern w:val="0"/>
-          <w:sz w:val="18"/>
-          <w:szCs w:val="18"/>
-        </w:rPr>
-        <w:t xml:space="preserve"> </w:t>
-      </w:r>
-      <w:proofErr w:type="spellStart"/>
-      <w:r>
-        <w:rPr>
-          <w:rFonts w:ascii="Verdana" w:eastAsia="굴림" w:hAnsi="Verdana" w:cs="굴림"/>
-          <w:color w:val="333333"/>
-          <w:kern w:val="0"/>
-          <w:sz w:val="18"/>
-          <w:szCs w:val="18"/>
-        </w:rPr>
-        <w:t>ezEKP</w:t>
-      </w:r>
-      <w:proofErr w:type="spellEnd"/>
-      <w:r>
-        <w:rPr>
-          <w:rFonts w:ascii="Verdana" w:eastAsia="굴림" w:hAnsi="Verdana" w:cs="굴림" w:hint="eastAsia"/>
-          <w:color w:val="333333"/>
-          <w:kern w:val="0"/>
-          <w:sz w:val="18"/>
-          <w:szCs w:val="18"/>
-        </w:rPr>
-        <w:t xml:space="preserve"> </w:t>
-      </w:r>
-      <w:r>
-        <w:rPr>
-          <w:rFonts w:ascii="Verdana" w:eastAsia="굴림" w:hAnsi="Verdana" w:cs="굴림" w:hint="eastAsia"/>
-          <w:color w:val="333333"/>
-          <w:kern w:val="0"/>
-          <w:sz w:val="18"/>
-          <w:szCs w:val="18"/>
-        </w:rPr>
-        <w:t>패키지가</w:t>
-      </w:r>
-      <w:r>
-        <w:rPr>
-          <w:rFonts w:ascii="Verdana" w:eastAsia="굴림" w:hAnsi="Verdana" w:cs="굴림" w:hint="eastAsia"/>
-          <w:color w:val="333333"/>
-          <w:kern w:val="0"/>
-          <w:sz w:val="18"/>
-          <w:szCs w:val="18"/>
-        </w:rPr>
-        <w:t xml:space="preserve"> </w:t>
-      </w:r>
-      <w:r>
-        <w:rPr>
-          <w:rFonts w:ascii="Verdana" w:eastAsia="굴림" w:hAnsi="Verdana" w:cs="굴림" w:hint="eastAsia"/>
-          <w:color w:val="333333"/>
-          <w:kern w:val="0"/>
-          <w:sz w:val="18"/>
-          <w:szCs w:val="18"/>
-        </w:rPr>
-        <w:t>설치되었다는</w:t>
-      </w:r>
-      <w:r>
-        <w:rPr>
-          <w:rFonts w:ascii="Verdana" w:eastAsia="굴림" w:hAnsi="Verdana" w:cs="굴림" w:hint="eastAsia"/>
-          <w:color w:val="333333"/>
-          <w:kern w:val="0"/>
-          <w:sz w:val="18"/>
-          <w:szCs w:val="18"/>
-        </w:rPr>
-        <w:t xml:space="preserve"> </w:t>
-      </w:r>
-      <w:r>
-        <w:rPr>
-          <w:rFonts w:ascii="Verdana" w:eastAsia="굴림" w:hAnsi="Verdana" w:cs="굴림" w:hint="eastAsia"/>
-          <w:color w:val="333333"/>
-          <w:kern w:val="0"/>
-          <w:sz w:val="18"/>
-          <w:szCs w:val="18"/>
-        </w:rPr>
-        <w:t>가정</w:t>
-      </w:r>
-      <w:r>
-        <w:rPr>
-          <w:rFonts w:ascii="Verdana" w:eastAsia="굴림" w:hAnsi="Verdana" w:cs="굴림" w:hint="eastAsia"/>
-          <w:color w:val="333333"/>
-          <w:kern w:val="0"/>
-          <w:sz w:val="18"/>
-          <w:szCs w:val="18"/>
-        </w:rPr>
-        <w:t xml:space="preserve"> </w:t>
-      </w:r>
-      <w:r>
-        <w:rPr>
-          <w:rFonts w:ascii="Verdana" w:eastAsia="굴림" w:hAnsi="Verdana" w:cs="굴림" w:hint="eastAsia"/>
-          <w:color w:val="333333"/>
-          <w:kern w:val="0"/>
-          <w:sz w:val="18"/>
-          <w:szCs w:val="18"/>
-        </w:rPr>
-        <w:t>하에</w:t>
-      </w:r>
-      <w:r>
-        <w:rPr>
-          <w:rFonts w:ascii="Verdana" w:eastAsia="굴림" w:hAnsi="Verdana" w:cs="굴림" w:hint="eastAsia"/>
-          <w:color w:val="333333"/>
-          <w:kern w:val="0"/>
-          <w:sz w:val="18"/>
-          <w:szCs w:val="18"/>
-        </w:rPr>
-        <w:t xml:space="preserve"> </w:t>
-      </w:r>
-      <w:r>
-        <w:rPr>
-          <w:rFonts w:ascii="Verdana" w:eastAsia="굴림" w:hAnsi="Verdana" w:cs="굴림"/>
-          <w:color w:val="333333"/>
-          <w:kern w:val="0"/>
-          <w:sz w:val="18"/>
-          <w:szCs w:val="18"/>
-        </w:rPr>
-        <w:t>아래의</w:t>
-      </w:r>
-      <w:r>
-        <w:rPr>
-          <w:rFonts w:ascii="Verdana" w:eastAsia="굴림" w:hAnsi="Verdana" w:cs="굴림"/>
-          <w:color w:val="333333"/>
-          <w:kern w:val="0"/>
-          <w:sz w:val="18"/>
-          <w:szCs w:val="18"/>
-        </w:rPr>
-        <w:t xml:space="preserve"> </w:t>
-      </w:r>
-      <w:r>
-        <w:rPr>
-          <w:rFonts w:ascii="Verdana" w:eastAsia="굴림" w:hAnsi="Verdana" w:cs="굴림"/>
-          <w:color w:val="333333"/>
-          <w:kern w:val="0"/>
-          <w:sz w:val="18"/>
-          <w:szCs w:val="18"/>
-        </w:rPr>
-        <w:t>작업을</w:t>
-      </w:r>
-      <w:r>
-        <w:rPr>
-          <w:rFonts w:ascii="Verdana" w:eastAsia="굴림" w:hAnsi="Verdana" w:cs="굴림"/>
-          <w:color w:val="333333"/>
-          <w:kern w:val="0"/>
-          <w:sz w:val="18"/>
-          <w:szCs w:val="18"/>
-        </w:rPr>
-        <w:t xml:space="preserve"> </w:t>
-      </w:r>
-      <w:r>
-        <w:rPr>
-          <w:rFonts w:ascii="Verdana" w:eastAsia="굴림" w:hAnsi="Verdana" w:cs="굴림"/>
-          <w:color w:val="333333"/>
-          <w:kern w:val="0"/>
-          <w:sz w:val="18"/>
-          <w:szCs w:val="18"/>
-        </w:rPr>
-        <w:t>수행</w:t>
-      </w:r>
-      <w:r>
-        <w:rPr>
-          <w:rFonts w:ascii="Verdana" w:eastAsia="굴림" w:hAnsi="Verdana" w:cs="굴림" w:hint="eastAsia"/>
-          <w:color w:val="333333"/>
-          <w:kern w:val="0"/>
-          <w:sz w:val="18"/>
-          <w:szCs w:val="18"/>
-        </w:rPr>
-        <w:t>한다</w:t>
-      </w:r>
-      <w:r>
-        <w:rPr>
-          <w:rFonts w:ascii="Verdana" w:eastAsia="굴림" w:hAnsi="Verdana" w:cs="굴림" w:hint="eastAsia"/>
-          <w:color w:val="333333"/>
-          <w:kern w:val="0"/>
-          <w:sz w:val="18"/>
-          <w:szCs w:val="18"/>
-        </w:rPr>
-        <w:t>.</w:t>
-      </w:r>
+        <w:pStyle w:val="ad"/>
+      </w:pPr>
     </w:p>
     <w:p>
       <w:pPr>
-        <w:pStyle w:val="ac"/>
-      </w:pPr>
-    </w:p>
-    <w:p>
-      <w:pPr>
-        <w:pStyle w:val="ad"/>
-      </w:pPr>
-      <w:r>
-        <w:pict>
-          <v:shape id="그림 29" o:spid="_x0000_i1026" type="#_x0000_t75" alt="BD21312_" style="width:12pt;height:12pt;visibility:visible;mso-wrap-style:square" o:bullet="t">
-            <v:imagedata r:id="rId14" o:title="BD21312_"/>
-          </v:shape>
-        </w:pict>
-      </w:r>
-      <w:r>
-        <w:tab/>
-      </w:r>
-      <w:r>
-        <w:rPr>
-          <w:rFonts w:hint="eastAsia"/>
-        </w:rPr>
-        <w:t>개요</w:t>
-      </w:r>
-    </w:p>
-    <w:p>
-      <w:pPr>
-        <w:pStyle w:val="ad"/>
-      </w:pPr>
-      <w:r>
-        <w:rPr>
-          <w:noProof/>
-        </w:rPr>
-        <w:drawing>
-          <wp:inline distT="0" distB="0" distL="0" distR="0" wp14:anchorId="76C6AB44" wp14:editId="3EA54E55">
-            <wp:extent cx="142875" cy="142875"/>
-            <wp:effectExtent l="0" t="0" r="9525" b="9525"/>
-            <wp:docPr id="1" name="그림 1" descr="BD21312_"/>
-            <wp:cNvGraphicFramePr>
-              <a:graphicFrameLocks xmlns:a="http://schemas.openxmlformats.org/drawingml/2006/main" noChangeAspect="1"/>
-            </wp:cNvGraphicFramePr>
-            <a:graphic xmlns:a="http://schemas.openxmlformats.org/drawingml/2006/main">
-              <a:graphicData uri="http://schemas.openxmlformats.org/drawingml/2006/picture">
-                <pic:pic xmlns:pic="http://schemas.openxmlformats.org/drawingml/2006/picture">
-                  <pic:nvPicPr>
-                    <pic:cNvPr id="0" name="그림 29" descr="BD21312_"/>
-                    <pic:cNvPicPr>
-                      <a:picLocks noChangeAspect="1" noChangeArrowheads="1"/>
-                    </pic:cNvPicPr>
-                  </pic:nvPicPr>
-                  <pic:blipFill>
-                    <a:blip r:embed="rId15">
-                      <a:extLst>
-                        <a:ext uri="{28A0092B-C50C-407E-A947-70E740481C1C}">
-                          <a14:useLocalDpi xmlns:a14="http://schemas.microsoft.com/office/drawing/2010/main" val="0"/>
-                        </a:ext>
-                      </a:extLst>
-                    </a:blip>
-                    <a:srcRect/>
-                    <a:stretch>
-                      <a:fillRect/>
-                    </a:stretch>
-                  </pic:blipFill>
-                  <pic:spPr bwMode="auto">
-                    <a:xfrm>
-                      <a:off x="0" y="0"/>
-                      <a:ext cx="142875" cy="142875"/>
-                    </a:xfrm>
-                    <a:prstGeom prst="rect">
-                      <a:avLst/>
-                    </a:prstGeom>
-                    <a:noFill/>
-                    <a:ln>
-                      <a:noFill/>
-                    </a:ln>
-                  </pic:spPr>
-                </pic:pic>
-              </a:graphicData>
-            </a:graphic>
-          </wp:inline>
-        </w:drawing>
-      </w:r>
-      <w:r>
-        <w:tab/>
-      </w:r>
-      <w:r>
-        <w:rPr>
-          <w:rFonts w:hint="eastAsia"/>
-        </w:rPr>
-        <w:t>설치</w:t>
-      </w:r>
-      <w:r>
-        <w:rPr>
-          <w:rFonts w:hint="eastAsia"/>
-        </w:rPr>
-        <w:t xml:space="preserve"> </w:t>
-      </w:r>
-      <w:r>
-        <w:rPr>
-          <w:rFonts w:hint="eastAsia"/>
-        </w:rPr>
-        <w:t>폴더</w:t>
-      </w:r>
-      <w:r>
-        <w:rPr>
-          <w:rFonts w:hint="eastAsia"/>
-        </w:rPr>
-        <w:t xml:space="preserve"> </w:t>
-      </w:r>
-      <w:r>
-        <w:rPr>
-          <w:rFonts w:hint="eastAsia"/>
-        </w:rPr>
-        <w:t>생성</w:t>
-      </w:r>
-    </w:p>
-    <w:p>
-      <w:pPr>
-        <w:pStyle w:val="ad"/>
-      </w:pPr>
-      <w:r>
-        <w:rPr>
-          <w:noProof/>
-        </w:rPr>
-        <w:drawing>
-          <wp:inline distT="0" distB="0" distL="0" distR="0" wp14:anchorId="66BAEBD1" wp14:editId="2BF5A212">
-            <wp:extent cx="142875" cy="142875"/>
-            <wp:effectExtent l="0" t="0" r="9525" b="9525"/>
-            <wp:docPr id="28" name="그림 28" descr="BD21312_"/>
-            <wp:cNvGraphicFramePr>
-              <a:graphicFrameLocks xmlns:a="http://schemas.openxmlformats.org/drawingml/2006/main" noChangeAspect="1"/>
-            </wp:cNvGraphicFramePr>
-            <a:graphic xmlns:a="http://schemas.openxmlformats.org/drawingml/2006/main">
-              <a:graphicData uri="http://schemas.openxmlformats.org/drawingml/2006/picture">
-                <pic:pic xmlns:pic="http://schemas.openxmlformats.org/drawingml/2006/picture">
-                  <pic:nvPicPr>
-                    <pic:cNvPr id="0" name="그림 26" descr="BD21312_"/>
-                    <pic:cNvPicPr>
-                      <a:picLocks noChangeAspect="1" noChangeArrowheads="1"/>
-                    </pic:cNvPicPr>
-                  </pic:nvPicPr>
-                  <pic:blipFill>
-                    <a:blip r:embed="rId15">
-                      <a:extLst>
-                        <a:ext uri="{28A0092B-C50C-407E-A947-70E740481C1C}">
-                          <a14:useLocalDpi xmlns:a14="http://schemas.microsoft.com/office/drawing/2010/main" val="0"/>
-                        </a:ext>
-                      </a:extLst>
-                    </a:blip>
-                    <a:srcRect/>
-                    <a:stretch>
-                      <a:fillRect/>
-                    </a:stretch>
-                  </pic:blipFill>
-                  <pic:spPr bwMode="auto">
-                    <a:xfrm>
-                      <a:off x="0" y="0"/>
-                      <a:ext cx="142875" cy="142875"/>
-                    </a:xfrm>
-                    <a:prstGeom prst="rect">
-                      <a:avLst/>
-                    </a:prstGeom>
-                    <a:noFill/>
-                    <a:ln>
-                      <a:noFill/>
-                    </a:ln>
-                  </pic:spPr>
-                </pic:pic>
-              </a:graphicData>
-            </a:graphic>
-          </wp:inline>
-        </w:drawing>
-      </w:r>
-      <w:r>
-        <w:tab/>
-      </w:r>
-      <w:r>
-        <w:rPr>
-          <w:rFonts w:hint="eastAsia"/>
-        </w:rPr>
-        <w:t xml:space="preserve">date </w:t>
-      </w:r>
-      <w:r>
-        <w:t>확인</w:t>
-      </w:r>
-      <w:r>
-        <w:rPr>
-          <w:rFonts w:hint="eastAsia"/>
-        </w:rPr>
-        <w:t xml:space="preserve"> </w:t>
-      </w:r>
-      <w:r>
-        <w:rPr>
-          <w:rFonts w:hint="eastAsia"/>
-        </w:rPr>
-        <w:t>및</w:t>
-      </w:r>
-      <w:r>
-        <w:rPr>
-          <w:rFonts w:hint="eastAsia"/>
-        </w:rPr>
-        <w:t xml:space="preserve"> </w:t>
-      </w:r>
-      <w:r>
-        <w:rPr>
-          <w:rFonts w:hint="eastAsia"/>
-        </w:rPr>
-        <w:t>설정</w:t>
-      </w:r>
-    </w:p>
-    <w:p>
-      <w:pPr>
-        <w:pStyle w:val="ad"/>
-      </w:pPr>
-      <w:r>
-        <w:pict>
-          <v:shape id="그림 27" o:spid="_x0000_i1027" type="#_x0000_t75" alt="BD21312_" style="width:12pt;height:12pt;visibility:visible;mso-wrap-style:square">
-            <v:imagedata r:id="rId14" o:title="BD21312_"/>
-          </v:shape>
-        </w:pict>
-      </w:r>
-      <w:r>
-        <w:tab/>
-      </w:r>
-      <w:r>
-        <w:rPr>
-          <w:rFonts w:hint="eastAsia"/>
-        </w:rPr>
-        <w:t>hostname</w:t>
-      </w:r>
-      <w:r>
-        <w:t xml:space="preserve"> </w:t>
-      </w:r>
-      <w:r>
-        <w:rPr>
-          <w:rFonts w:hint="eastAsia"/>
-        </w:rPr>
-        <w:t>등록</w:t>
-      </w:r>
-    </w:p>
-    <w:p>
-      <w:pPr>
-        <w:pStyle w:val="ad"/>
-      </w:pPr>
-      <w:r>
-        <w:rPr>
-          <w:noProof/>
-        </w:rPr>
-        <w:drawing>
-          <wp:inline distT="0" distB="0" distL="0" distR="0" wp14:anchorId="09574AA9" wp14:editId="74D7D8C2">
-            <wp:extent cx="142875" cy="142875"/>
-            <wp:effectExtent l="0" t="0" r="9525" b="9525"/>
-            <wp:docPr id="26" name="그림 26" descr="BD21312_"/>
-            <wp:cNvGraphicFramePr>
-              <a:graphicFrameLocks xmlns:a="http://schemas.openxmlformats.org/drawingml/2006/main" noChangeAspect="1"/>
-            </wp:cNvGraphicFramePr>
-            <a:graphic xmlns:a="http://schemas.openxmlformats.org/drawingml/2006/main">
-              <a:graphicData uri="http://schemas.openxmlformats.org/drawingml/2006/picture">
-                <pic:pic xmlns:pic="http://schemas.openxmlformats.org/drawingml/2006/picture">
-                  <pic:nvPicPr>
-                    <pic:cNvPr id="0" name="그림 28" descr="BD21312_"/>
-                    <pic:cNvPicPr>
-                      <a:picLocks noChangeAspect="1" noChangeArrowheads="1"/>
-                    </pic:cNvPicPr>
-                  </pic:nvPicPr>
-                  <pic:blipFill>
-                    <a:blip r:embed="rId15">
-                      <a:extLst>
-                        <a:ext uri="{28A0092B-C50C-407E-A947-70E740481C1C}">
-                          <a14:useLocalDpi xmlns:a14="http://schemas.microsoft.com/office/drawing/2010/main" val="0"/>
-                        </a:ext>
-                      </a:extLst>
-                    </a:blip>
-                    <a:srcRect/>
-                    <a:stretch>
-                      <a:fillRect/>
-                    </a:stretch>
-                  </pic:blipFill>
-                  <pic:spPr bwMode="auto">
-                    <a:xfrm>
-                      <a:off x="0" y="0"/>
-                      <a:ext cx="142875" cy="142875"/>
-                    </a:xfrm>
-                    <a:prstGeom prst="rect">
-                      <a:avLst/>
-                    </a:prstGeom>
-                    <a:noFill/>
-                    <a:ln>
-                      <a:noFill/>
-                    </a:ln>
-                  </pic:spPr>
-                </pic:pic>
-              </a:graphicData>
-            </a:graphic>
-          </wp:inline>
-        </w:drawing>
-      </w:r>
-      <w:r>
-        <w:tab/>
-      </w:r>
-      <w:proofErr w:type="spellStart"/>
-      <w:r>
-        <w:rPr>
-          <w:rFonts w:hint="eastAsia"/>
-        </w:rPr>
-        <w:t>jmocha</w:t>
-      </w:r>
-      <w:proofErr w:type="spellEnd"/>
-      <w:r>
-        <w:rPr>
-          <w:rFonts w:hint="eastAsia"/>
-        </w:rPr>
-        <w:t xml:space="preserve"> </w:t>
-      </w:r>
-      <w:r>
-        <w:rPr>
-          <w:rFonts w:hint="eastAsia"/>
-        </w:rPr>
-        <w:t>계정</w:t>
-      </w:r>
-      <w:r>
-        <w:rPr>
-          <w:rFonts w:hint="eastAsia"/>
-        </w:rPr>
-        <w:t xml:space="preserve"> </w:t>
-      </w:r>
-      <w:r>
-        <w:rPr>
-          <w:rFonts w:hint="eastAsia"/>
-        </w:rPr>
-        <w:t>생성</w:t>
-      </w:r>
-    </w:p>
-    <w:p>
-      <w:pPr>
-        <w:pStyle w:val="ad"/>
-      </w:pPr>
-      <w:r>
-        <w:pict>
-          <v:shape id="그림 25" o:spid="_x0000_i1028" type="#_x0000_t75" alt="BD21312_" style="width:12pt;height:12pt;visibility:visible;mso-wrap-style:square" o:bullet="t">
-            <v:imagedata r:id="rId14" o:title="BD21312_"/>
-          </v:shape>
-        </w:pict>
-      </w:r>
-      <w:r>
-        <w:tab/>
-      </w:r>
-      <w:r>
-        <w:rPr>
-          <w:rFonts w:hint="eastAsia"/>
-        </w:rPr>
-        <w:t xml:space="preserve">alias </w:t>
-      </w:r>
-      <w:r>
-        <w:rPr>
-          <w:rFonts w:hint="eastAsia"/>
-        </w:rPr>
-        <w:t>추가</w:t>
-      </w:r>
-    </w:p>
-    <w:p>
-      <w:pPr>
-        <w:pStyle w:val="ad"/>
-      </w:pPr>
-      <w:r>
-        <w:rPr>
-          <w:noProof/>
-        </w:rPr>
-        <w:drawing>
-          <wp:inline distT="0" distB="0" distL="0" distR="0" wp14:anchorId="17A3807E" wp14:editId="7685188B">
-            <wp:extent cx="142875" cy="142875"/>
-            <wp:effectExtent l="0" t="0" r="9525" b="9525"/>
-            <wp:docPr id="24" name="그림 24" descr="BD21312_"/>
-            <wp:cNvGraphicFramePr>
-              <a:graphicFrameLocks xmlns:a="http://schemas.openxmlformats.org/drawingml/2006/main" noChangeAspect="1"/>
-            </wp:cNvGraphicFramePr>
-            <a:graphic xmlns:a="http://schemas.openxmlformats.org/drawingml/2006/main">
-              <a:graphicData uri="http://schemas.openxmlformats.org/drawingml/2006/picture">
-                <pic:pic xmlns:pic="http://schemas.openxmlformats.org/drawingml/2006/picture">
-                  <pic:nvPicPr>
-                    <pic:cNvPr id="0" name="그림 29" descr="BD21312_"/>
-                    <pic:cNvPicPr>
-                      <a:picLocks noChangeAspect="1" noChangeArrowheads="1"/>
-                    </pic:cNvPicPr>
-                  </pic:nvPicPr>
-                  <pic:blipFill>
-                    <a:blip r:embed="rId15">
-                      <a:extLst>
-                        <a:ext uri="{28A0092B-C50C-407E-A947-70E740481C1C}">
-                          <a14:useLocalDpi xmlns:a14="http://schemas.microsoft.com/office/drawing/2010/main" val="0"/>
-                        </a:ext>
-                      </a:extLst>
-                    </a:blip>
-                    <a:srcRect/>
-                    <a:stretch>
-                      <a:fillRect/>
-                    </a:stretch>
-                  </pic:blipFill>
-                  <pic:spPr bwMode="auto">
-                    <a:xfrm>
-                      <a:off x="0" y="0"/>
-                      <a:ext cx="142875" cy="142875"/>
-                    </a:xfrm>
-                    <a:prstGeom prst="rect">
-                      <a:avLst/>
-                    </a:prstGeom>
-                    <a:noFill/>
-                    <a:ln>
-                      <a:noFill/>
-                    </a:ln>
-                  </pic:spPr>
-                </pic:pic>
-              </a:graphicData>
-            </a:graphic>
-          </wp:inline>
-        </w:drawing>
-      </w:r>
-      <w:r>
-        <w:rPr>
-          <w:rFonts w:hint="eastAsia"/>
-          <w:noProof/>
-        </w:rPr>
-        <w:t xml:space="preserve"> </w:t>
-      </w:r>
-      <w:r>
-        <w:t>/</w:t>
-      </w:r>
-      <w:proofErr w:type="spellStart"/>
-      <w:r>
-        <w:t>etc</w:t>
-      </w:r>
-      <w:proofErr w:type="spellEnd"/>
-      <w:r>
-        <w:t>/</w:t>
-      </w:r>
-      <w:proofErr w:type="spellStart"/>
-      <w:r>
-        <w:t>my.cnf</w:t>
-      </w:r>
-      <w:proofErr w:type="spellEnd"/>
-      <w:r>
-        <w:t>, /</w:t>
-      </w:r>
-      <w:proofErr w:type="spellStart"/>
-      <w:r>
-        <w:t>etc</w:t>
-      </w:r>
-      <w:proofErr w:type="spellEnd"/>
-      <w:r>
-        <w:t>/</w:t>
-      </w:r>
-      <w:proofErr w:type="spellStart"/>
-      <w:r>
-        <w:t>my.cnf.d</w:t>
-      </w:r>
-      <w:proofErr w:type="spellEnd"/>
-      <w:r>
-        <w:t xml:space="preserve">/ </w:t>
-      </w:r>
-      <w:r>
-        <w:t>삭제</w:t>
-      </w:r>
-    </w:p>
-    <w:p>
-      <w:pPr>
-        <w:pStyle w:val="ad"/>
-      </w:pPr>
-      <w:r>
-        <w:rPr>
-          <w:noProof/>
-        </w:rPr>
-        <w:drawing>
-          <wp:inline distT="0" distB="0" distL="0" distR="0" wp14:anchorId="6B0B843B" wp14:editId="33DCAF77">
-            <wp:extent cx="142875" cy="142875"/>
-            <wp:effectExtent l="0" t="0" r="9525" b="9525"/>
-            <wp:docPr id="23" name="그림 23" descr="BD21312_"/>
-            <wp:cNvGraphicFramePr>
-              <a:graphicFrameLocks xmlns:a="http://schemas.openxmlformats.org/drawingml/2006/main" noChangeAspect="1"/>
-            </wp:cNvGraphicFramePr>
-            <a:graphic xmlns:a="http://schemas.openxmlformats.org/drawingml/2006/main">
-              <a:graphicData uri="http://schemas.openxmlformats.org/drawingml/2006/picture">
-                <pic:pic xmlns:pic="http://schemas.openxmlformats.org/drawingml/2006/picture">
-                  <pic:nvPicPr>
-                    <pic:cNvPr id="0" name="그림 30" descr="BD21312_"/>
-                    <pic:cNvPicPr>
-                      <a:picLocks noChangeAspect="1" noChangeArrowheads="1"/>
-                    </pic:cNvPicPr>
-                  </pic:nvPicPr>
-                  <pic:blipFill>
-                    <a:blip r:embed="rId15">
-                      <a:extLst>
-                        <a:ext uri="{28A0092B-C50C-407E-A947-70E740481C1C}">
-                          <a14:useLocalDpi xmlns:a14="http://schemas.microsoft.com/office/drawing/2010/main" val="0"/>
-                        </a:ext>
-                      </a:extLst>
-                    </a:blip>
-                    <a:srcRect/>
-                    <a:stretch>
-                      <a:fillRect/>
-                    </a:stretch>
-                  </pic:blipFill>
-                  <pic:spPr bwMode="auto">
-                    <a:xfrm>
-                      <a:off x="0" y="0"/>
-                      <a:ext cx="142875" cy="142875"/>
-                    </a:xfrm>
-                    <a:prstGeom prst="rect">
-                      <a:avLst/>
-                    </a:prstGeom>
-                    <a:noFill/>
-                    <a:ln>
-                      <a:noFill/>
-                    </a:ln>
-                  </pic:spPr>
-                </pic:pic>
-              </a:graphicData>
-            </a:graphic>
-          </wp:inline>
-        </w:drawing>
-      </w:r>
-      <w:r>
-        <w:tab/>
-      </w:r>
-      <w:r>
-        <w:t>postfix stop &amp; disable</w:t>
-      </w:r>
-    </w:p>
-    <w:p>
-      <w:pPr>
-        <w:pStyle w:val="ad"/>
-      </w:pPr>
-      <w:r>
-        <w:pict>
-          <v:shape id="그림 22" o:spid="_x0000_i1029" type="#_x0000_t75" alt="BD21312_" style="width:12pt;height:12pt;visibility:visible;mso-wrap-style:square">
-            <v:imagedata r:id="rId14" o:title="BD21312_"/>
-          </v:shape>
-        </w:pict>
-      </w:r>
-      <w:r>
-        <w:tab/>
-      </w:r>
-      <w:proofErr w:type="spellStart"/>
-      <w:r>
-        <w:t>iptables</w:t>
-      </w:r>
-      <w:proofErr w:type="spellEnd"/>
-      <w:r>
-        <w:t xml:space="preserve"> flush</w:t>
-      </w:r>
-    </w:p>
-    <w:p>
-      <w:pPr>
-        <w:pStyle w:val="ad"/>
-      </w:pPr>
-      <w:r>
-        <w:pict>
-          <v:shape id="그림 21" o:spid="_x0000_i1030" type="#_x0000_t75" alt="BD21312_" style="width:12pt;height:12pt;visibility:visible;mso-wrap-style:square">
-            <v:imagedata r:id="rId14" o:title="BD21312_"/>
-          </v:shape>
-        </w:pict>
-      </w:r>
-      <w:r>
-        <w:tab/>
-      </w:r>
-      <w:proofErr w:type="spellStart"/>
-      <w:r>
-        <w:t>firewalld</w:t>
-      </w:r>
-      <w:proofErr w:type="spellEnd"/>
-      <w:r>
-        <w:t xml:space="preserve"> stop &amp; disable</w:t>
-      </w:r>
-    </w:p>
-    <w:p>
-      <w:pPr>
-        <w:pStyle w:val="ad"/>
-      </w:pPr>
-      <w:r>
-        <w:rPr>
-          <w:noProof/>
-        </w:rPr>
-        <w:drawing>
-          <wp:inline distT="0" distB="0" distL="0" distR="0" wp14:anchorId="34442E97" wp14:editId="36BC1FD6">
-            <wp:extent cx="142875" cy="142875"/>
-            <wp:effectExtent l="0" t="0" r="9525" b="9525"/>
-            <wp:docPr id="3" name="그림 3" descr="BD21312_"/>
-            <wp:cNvGraphicFramePr>
-              <a:graphicFrameLocks xmlns:a="http://schemas.openxmlformats.org/drawingml/2006/main" noChangeAspect="1"/>
-            </wp:cNvGraphicFramePr>
-            <a:graphic xmlns:a="http://schemas.openxmlformats.org/drawingml/2006/main">
-              <a:graphicData uri="http://schemas.openxmlformats.org/drawingml/2006/picture">
-                <pic:pic xmlns:pic="http://schemas.openxmlformats.org/drawingml/2006/picture">
-                  <pic:nvPicPr>
-                    <pic:cNvPr id="0" name="그림 21" descr="BD21312_"/>
-                    <pic:cNvPicPr>
-                      <a:picLocks noChangeAspect="1" noChangeArrowheads="1"/>
-                    </pic:cNvPicPr>
-                  </pic:nvPicPr>
-                  <pic:blipFill>
-                    <a:blip r:embed="rId15">
-                      <a:extLst>
-                        <a:ext uri="{28A0092B-C50C-407E-A947-70E740481C1C}">
-                          <a14:useLocalDpi xmlns:a14="http://schemas.microsoft.com/office/drawing/2010/main" val="0"/>
-                        </a:ext>
-                      </a:extLst>
-                    </a:blip>
-                    <a:srcRect/>
-                    <a:stretch>
-                      <a:fillRect/>
-                    </a:stretch>
-                  </pic:blipFill>
-                  <pic:spPr bwMode="auto">
-                    <a:xfrm>
-                      <a:off x="0" y="0"/>
-                      <a:ext cx="142875" cy="142875"/>
-                    </a:xfrm>
-                    <a:prstGeom prst="rect">
-                      <a:avLst/>
-                    </a:prstGeom>
-                    <a:noFill/>
-                    <a:ln>
-                      <a:noFill/>
-                    </a:ln>
-                  </pic:spPr>
-                </pic:pic>
-              </a:graphicData>
-            </a:graphic>
-          </wp:inline>
-        </w:drawing>
-      </w:r>
-      <w:r>
-        <w:tab/>
-      </w:r>
-      <w:r>
-        <w:rPr>
-          <w:rFonts w:hint="eastAsia"/>
-        </w:rPr>
-        <w:t xml:space="preserve">telnet </w:t>
-      </w:r>
-      <w:r>
-        <w:rPr>
-          <w:rFonts w:hint="eastAsia"/>
-        </w:rPr>
-        <w:t>설치</w:t>
-      </w:r>
-    </w:p>
-    <w:p>
-      <w:pPr>
-        <w:pStyle w:val="ad"/>
-      </w:pPr>
-    </w:p>
-    <w:p/>
-    <w:p/>
-    <w:p>
-      <w:pPr>
         <w:sectPr>
-          <w:headerReference w:type="default" r:id="rId16"/>
-          <w:footerReference w:type="default" r:id="rId17"/>
+          <w:headerReference w:type="default" r:id="rId14"/>
+          <w:footerReference w:type="default" r:id="rId15"/>
           <w:pgSz w:w="11906" w:h="16838" w:code="9"/>
           <w:pgMar w:top="1701" w:right="1134" w:bottom="1418" w:left="1418" w:header="567" w:footer="709" w:gutter="0"/>
           <w:cols w:space="425"/>
@@ -3018,7 +2139,7 @@
           <w:numId w:val="35"/>
         </w:numPr>
       </w:pPr>
-      <w:bookmarkStart w:id="46" w:name="_Toc28005351"/>
+      <w:bookmarkStart w:id="45" w:name="_Toc28005351"/>
       <w:r>
         <w:rPr>
           <w:rFonts w:hint="eastAsia"/>
@@ -3026,7 +2147,7 @@
         <w:lastRenderedPageBreak/>
         <w:t>개요</w:t>
       </w:r>
-      <w:bookmarkEnd w:id="46"/>
+      <w:bookmarkEnd w:id="45"/>
     </w:p>
     <w:p>
       <w:pPr>
@@ -4742,7 +3863,7 @@
         <w:spacing w:before="100" w:beforeAutospacing="1" w:after="100" w:afterAutospacing="1" w:line="240" w:lineRule="auto"/>
         <w:jc w:val="left"/>
         <w:rPr>
-          <w:rFonts w:ascii="Verdana" w:eastAsia="굴림" w:hAnsi="Verdana" w:cs="굴림" w:hint="eastAsia"/>
+          <w:rFonts w:ascii="Verdana" w:eastAsia="굴림" w:hAnsi="Verdana" w:cs="굴림"/>
           <w:color w:val="333333"/>
           <w:kern w:val="0"/>
           <w:sz w:val="18"/>
@@ -6200,7 +5321,7 @@
         <w:spacing w:before="100" w:beforeAutospacing="1" w:after="100" w:afterAutospacing="1" w:line="240" w:lineRule="auto"/>
         <w:jc w:val="left"/>
         <w:rPr>
-          <w:rFonts w:ascii="Verdana" w:eastAsia="굴림" w:hAnsi="Verdana" w:cs="굴림" w:hint="eastAsia"/>
+          <w:rFonts w:ascii="Verdana" w:eastAsia="굴림" w:hAnsi="Verdana" w:cs="굴림"/>
           <w:color w:val="333333"/>
           <w:kern w:val="0"/>
           <w:sz w:val="18"/>
@@ -7325,7 +6446,7 @@
         </w:rPr>
         <w:t xml:space="preserve">. </w:t>
       </w:r>
-      <w:hyperlink r:id="rId18" w:anchor="answer-539042" w:history="1">
+      <w:hyperlink r:id="rId16" w:anchor="answer-539042" w:history="1">
         <w:r>
           <w:rPr>
             <w:rStyle w:val="a5"/>
@@ -7344,17 +6465,7 @@
             <w:sz w:val="18"/>
             <w:szCs w:val="18"/>
           </w:rPr>
-          <w:t>참</w:t>
-        </w:r>
-        <w:r>
-          <w:rPr>
-            <w:rStyle w:val="a5"/>
-            <w:rFonts w:ascii="Verdana" w:eastAsia="굴림" w:hAnsi="Verdana" w:cs="굴림"/>
-            <w:kern w:val="0"/>
-            <w:sz w:val="18"/>
-            <w:szCs w:val="18"/>
-          </w:rPr>
-          <w:t>조</w:t>
+          <w:t>참조</w:t>
         </w:r>
         <w:r>
           <w:rPr>
@@ -7627,7 +6738,7 @@
         </w:rPr>
         <w:t xml:space="preserve"> </w:t>
       </w:r>
-      <w:hyperlink r:id="rId19" w:history="1">
+      <w:hyperlink r:id="rId17" w:history="1">
         <w:r>
           <w:rPr>
             <w:rStyle w:val="a5"/>
@@ -7708,14 +6819,14 @@
           <w:numId w:val="35"/>
         </w:numPr>
       </w:pPr>
-      <w:bookmarkStart w:id="47" w:name="_Toc28005352"/>
+      <w:bookmarkStart w:id="46" w:name="_Toc28005352"/>
       <w:r>
         <w:rPr>
           <w:rFonts w:hint="eastAsia"/>
         </w:rPr>
         <w:t>설치 폴더 생성</w:t>
       </w:r>
-      <w:bookmarkEnd w:id="47"/>
+      <w:bookmarkEnd w:id="46"/>
     </w:p>
     <w:p>
       <w:pPr>
@@ -7940,7 +7051,7 @@
           <w:numId w:val="35"/>
         </w:numPr>
       </w:pPr>
-      <w:bookmarkStart w:id="48" w:name="_Toc28005353"/>
+      <w:bookmarkStart w:id="47" w:name="_Toc28005353"/>
       <w:r>
         <w:rPr>
           <w:rFonts w:hint="eastAsia"/>
@@ -7965,7 +7076,7 @@
         </w:rPr>
         <w:t>설치</w:t>
       </w:r>
-      <w:bookmarkEnd w:id="48"/>
+      <w:bookmarkEnd w:id="47"/>
     </w:p>
     <w:p>
       <w:pPr>
@@ -7990,7 +7101,7 @@
           <w:szCs w:val="18"/>
         </w:rPr>
       </w:pPr>
-      <w:hyperlink r:id="rId20" w:history="1">
+      <w:hyperlink r:id="rId18" w:history="1">
         <w:r>
           <w:rPr>
             <w:rStyle w:val="a5"/>
@@ -8037,7 +7148,7 @@
                     </pic:cNvPicPr>
                   </pic:nvPicPr>
                   <pic:blipFill>
-                    <a:blip r:embed="rId21">
+                    <a:blip r:embed="rId19">
                       <a:extLst>
                         <a:ext uri="{28A0092B-C50C-407E-A947-70E740481C1C}">
                           <a14:useLocalDpi xmlns:a14="http://schemas.microsoft.com/office/drawing/2010/main" val="0"/>
@@ -8092,21 +7203,19 @@
           <w:szCs w:val="18"/>
         </w:rPr>
       </w:pPr>
-      <w:proofErr w:type="spellStart"/>
-      <w:r>
-        <w:rPr>
-          <w:rFonts w:ascii="Verdana" w:eastAsia="굴림" w:hAnsi="Verdana" w:cs="굴림" w:hint="eastAsia"/>
-          <w:color w:val="333333"/>
-          <w:kern w:val="0"/>
-          <w:sz w:val="18"/>
-          <w:szCs w:val="18"/>
-        </w:rPr>
-        <w:t>apr</w:t>
-      </w:r>
-      <w:proofErr w:type="spellEnd"/>
-      <w:r>
-        <w:rPr>
-          <w:rFonts w:ascii="Verdana" w:eastAsia="굴림" w:hAnsi="Verdana" w:cs="굴림" w:hint="eastAsia"/>
+      <w:r>
+        <w:rPr>
+          <w:rFonts w:ascii="Verdana" w:eastAsia="굴림" w:hAnsi="Verdana" w:cs="굴림" w:hint="eastAsia"/>
+          <w:color w:val="333333"/>
+          <w:kern w:val="0"/>
+          <w:sz w:val="18"/>
+          <w:szCs w:val="18"/>
+        </w:rPr>
+        <w:t>expat</w:t>
+      </w:r>
+      <w:r>
+        <w:rPr>
+          <w:rFonts w:ascii="Verdana" w:eastAsia="굴림" w:hAnsi="Verdana" w:cs="굴림"/>
           <w:color w:val="333333"/>
           <w:kern w:val="0"/>
           <w:sz w:val="18"/>
@@ -8158,7 +7267,7 @@
           <w:sz w:val="18"/>
           <w:szCs w:val="18"/>
         </w:rPr>
-        <w:t>cd /</w:t>
+        <w:t>yum install expat-</w:t>
       </w:r>
       <w:proofErr w:type="spellStart"/>
       <w:r>
@@ -8170,7 +7279,7 @@
           <w:sz w:val="18"/>
           <w:szCs w:val="18"/>
         </w:rPr>
-        <w:t>tmp</w:t>
+        <w:t>devel</w:t>
       </w:r>
       <w:proofErr w:type="spellEnd"/>
       <w:r>
@@ -8182,21 +7291,156 @@
           <w:sz w:val="18"/>
           <w:szCs w:val="18"/>
         </w:rPr>
-        <w:t>/</w:t>
-      </w:r>
+        <w:br/>
+      </w:r>
+    </w:p>
+    <w:p>
+      <w:pPr>
+        <w:pStyle w:val="a6"/>
+        <w:widowControl/>
+        <w:numPr>
+          <w:ilvl w:val="0"/>
+          <w:numId w:val="8"/>
+        </w:numPr>
+        <w:shd w:val="clear" w:color="auto" w:fill="FFFFFF"/>
+        <w:wordWrap/>
+        <w:autoSpaceDE/>
+        <w:autoSpaceDN/>
+        <w:spacing w:before="100" w:beforeAutospacing="1" w:after="100" w:afterAutospacing="1" w:line="240" w:lineRule="auto"/>
+        <w:ind w:leftChars="0"/>
+        <w:jc w:val="left"/>
+        <w:rPr>
+          <w:rFonts w:ascii="Verdana" w:eastAsia="굴림" w:hAnsi="Verdana" w:cs="굴림"/>
+          <w:color w:val="333333"/>
+          <w:kern w:val="0"/>
+          <w:sz w:val="18"/>
+          <w:szCs w:val="18"/>
+        </w:rPr>
+      </w:pPr>
       <w:proofErr w:type="spellStart"/>
       <w:r>
         <w:rPr>
-          <w:rFonts w:ascii="Verdana" w:eastAsia="굴림" w:hAnsi="Verdana" w:cs="굴림"/>
-          <w:b/>
-          <w:color w:val="333333"/>
-          <w:kern w:val="0"/>
-          <w:sz w:val="18"/>
-          <w:szCs w:val="18"/>
-        </w:rPr>
-        <w:t>install_apache</w:t>
+          <w:rFonts w:ascii="Verdana" w:eastAsia="굴림" w:hAnsi="Verdana" w:cs="굴림" w:hint="eastAsia"/>
+          <w:color w:val="333333"/>
+          <w:kern w:val="0"/>
+          <w:sz w:val="18"/>
+          <w:szCs w:val="18"/>
+        </w:rPr>
+        <w:t>a</w:t>
+      </w:r>
+      <w:r>
+        <w:rPr>
+          <w:rFonts w:ascii="Verdana" w:eastAsia="굴림" w:hAnsi="Verdana" w:cs="굴림" w:hint="eastAsia"/>
+          <w:color w:val="333333"/>
+          <w:kern w:val="0"/>
+          <w:sz w:val="18"/>
+          <w:szCs w:val="18"/>
+        </w:rPr>
+        <w:t>pr</w:t>
       </w:r>
       <w:proofErr w:type="spellEnd"/>
+      <w:r>
+        <w:rPr>
+          <w:rFonts w:ascii="Verdana" w:eastAsia="굴림" w:hAnsi="Verdana" w:cs="굴림" w:hint="eastAsia"/>
+          <w:color w:val="333333"/>
+          <w:kern w:val="0"/>
+          <w:sz w:val="18"/>
+          <w:szCs w:val="18"/>
+        </w:rPr>
+        <w:t xml:space="preserve">, </w:t>
+      </w:r>
+      <w:proofErr w:type="spellStart"/>
+      <w:r>
+        <w:rPr>
+          <w:rFonts w:ascii="Verdana" w:eastAsia="굴림" w:hAnsi="Verdana" w:cs="굴림"/>
+          <w:color w:val="333333"/>
+          <w:kern w:val="0"/>
+          <w:sz w:val="18"/>
+          <w:szCs w:val="18"/>
+        </w:rPr>
+        <w:t>apr-util</w:t>
+      </w:r>
+      <w:proofErr w:type="spellEnd"/>
+      <w:r>
+        <w:rPr>
+          <w:rFonts w:ascii="Verdana" w:eastAsia="굴림" w:hAnsi="Verdana" w:cs="굴림"/>
+          <w:color w:val="333333"/>
+          <w:kern w:val="0"/>
+          <w:sz w:val="18"/>
+          <w:szCs w:val="18"/>
+        </w:rPr>
+        <w:t xml:space="preserve"> </w:t>
+      </w:r>
+      <w:r>
+        <w:rPr>
+          <w:rFonts w:ascii="Verdana" w:eastAsia="굴림" w:hAnsi="Verdana" w:cs="굴림" w:hint="eastAsia"/>
+          <w:color w:val="333333"/>
+          <w:kern w:val="0"/>
+          <w:sz w:val="18"/>
+          <w:szCs w:val="18"/>
+        </w:rPr>
+        <w:t>다운로드</w:t>
+      </w:r>
+      <w:r>
+        <w:rPr>
+          <w:rFonts w:ascii="Verdana" w:eastAsia="굴림" w:hAnsi="Verdana" w:cs="굴림" w:hint="eastAsia"/>
+          <w:color w:val="333333"/>
+          <w:kern w:val="0"/>
+          <w:sz w:val="18"/>
+          <w:szCs w:val="18"/>
+        </w:rPr>
+        <w:t xml:space="preserve"> </w:t>
+      </w:r>
+      <w:r>
+        <w:rPr>
+          <w:rFonts w:ascii="Verdana" w:eastAsia="굴림" w:hAnsi="Verdana" w:cs="굴림" w:hint="eastAsia"/>
+          <w:color w:val="333333"/>
+          <w:kern w:val="0"/>
+          <w:sz w:val="18"/>
+          <w:szCs w:val="18"/>
+        </w:rPr>
+        <w:t>및</w:t>
+      </w:r>
+      <w:r>
+        <w:rPr>
+          <w:rFonts w:ascii="Verdana" w:eastAsia="굴림" w:hAnsi="Verdana" w:cs="굴림" w:hint="eastAsia"/>
+          <w:color w:val="333333"/>
+          <w:kern w:val="0"/>
+          <w:sz w:val="18"/>
+          <w:szCs w:val="18"/>
+        </w:rPr>
+        <w:t xml:space="preserve"> </w:t>
+      </w:r>
+      <w:r>
+        <w:rPr>
+          <w:rFonts w:ascii="Verdana" w:eastAsia="굴림" w:hAnsi="Verdana" w:cs="굴림" w:hint="eastAsia"/>
+          <w:color w:val="333333"/>
+          <w:kern w:val="0"/>
+          <w:sz w:val="18"/>
+          <w:szCs w:val="18"/>
+        </w:rPr>
+        <w:t>압축</w:t>
+      </w:r>
+      <w:r>
+        <w:rPr>
+          <w:rFonts w:ascii="Verdana" w:eastAsia="굴림" w:hAnsi="Verdana" w:cs="굴림" w:hint="eastAsia"/>
+          <w:color w:val="333333"/>
+          <w:kern w:val="0"/>
+          <w:sz w:val="18"/>
+          <w:szCs w:val="18"/>
+        </w:rPr>
+        <w:t xml:space="preserve"> </w:t>
+      </w:r>
+      <w:r>
+        <w:rPr>
+          <w:rFonts w:ascii="Verdana" w:eastAsia="굴림" w:hAnsi="Verdana" w:cs="굴림" w:hint="eastAsia"/>
+          <w:color w:val="333333"/>
+          <w:kern w:val="0"/>
+          <w:sz w:val="18"/>
+          <w:szCs w:val="18"/>
+        </w:rPr>
+        <w:t>해제</w:t>
+      </w:r>
     </w:p>
     <w:p>
       <w:pPr>
@@ -8215,50 +7459,61 @@
         <w:jc w:val="left"/>
         <w:rPr>
           <w:rFonts w:ascii="Verdana" w:eastAsia="굴림" w:hAnsi="Verdana" w:cs="굴림"/>
-          <w:color w:val="333333"/>
-          <w:kern w:val="0"/>
-          <w:sz w:val="18"/>
-          <w:szCs w:val="18"/>
-        </w:rPr>
-      </w:pPr>
+          <w:b/>
+          <w:color w:val="333333"/>
+          <w:kern w:val="0"/>
+          <w:sz w:val="18"/>
+          <w:szCs w:val="18"/>
+        </w:rPr>
+      </w:pPr>
+      <w:r>
+        <w:rPr>
+          <w:rFonts w:ascii="Verdana" w:eastAsia="굴림" w:hAnsi="Verdana" w:cs="굴림"/>
+          <w:b/>
+          <w:color w:val="333333"/>
+          <w:kern w:val="0"/>
+          <w:sz w:val="18"/>
+          <w:szCs w:val="18"/>
+        </w:rPr>
+        <w:t>cd /</w:t>
+      </w:r>
       <w:proofErr w:type="spellStart"/>
       <w:r>
         <w:rPr>
           <w:rFonts w:ascii="Verdana" w:eastAsia="굴림" w:hAnsi="Verdana" w:cs="굴림"/>
           <w:b/>
-          <w:bCs/>
-          <w:color w:val="333333"/>
-          <w:kern w:val="0"/>
-          <w:sz w:val="18"/>
-          <w:szCs w:val="18"/>
-        </w:rPr>
-        <w:t>wget</w:t>
+          <w:color w:val="333333"/>
+          <w:kern w:val="0"/>
+          <w:sz w:val="18"/>
+          <w:szCs w:val="18"/>
+        </w:rPr>
+        <w:t>tmp</w:t>
       </w:r>
       <w:proofErr w:type="spellEnd"/>
       <w:r>
         <w:rPr>
           <w:rFonts w:ascii="Verdana" w:eastAsia="굴림" w:hAnsi="Verdana" w:cs="굴림"/>
           <w:b/>
-          <w:bCs/>
-          <w:color w:val="333333"/>
-          <w:kern w:val="0"/>
-          <w:sz w:val="18"/>
-          <w:szCs w:val="18"/>
-        </w:rPr>
-        <w:t xml:space="preserve"> </w:t>
-      </w:r>
-      <w:r>
-        <w:rPr>
-          <w:rFonts w:ascii="Verdana" w:eastAsia="굴림" w:hAnsi="Verdana" w:cs="굴림"/>
-          <w:b/>
-          <w:bCs/>
-          <w:color w:val="333333"/>
-          <w:kern w:val="0"/>
-          <w:sz w:val="18"/>
-          <w:szCs w:val="18"/>
-        </w:rPr>
-        <w:t>http://apache.mirror.cdnetworks.com//apr/apr-1.7.0.tar.gz</w:t>
-      </w:r>
+          <w:color w:val="333333"/>
+          <w:kern w:val="0"/>
+          <w:sz w:val="18"/>
+          <w:szCs w:val="18"/>
+        </w:rPr>
+        <w:t>/</w:t>
+      </w:r>
+      <w:proofErr w:type="spellStart"/>
+      <w:r>
+        <w:rPr>
+          <w:rFonts w:ascii="Verdana" w:eastAsia="굴림" w:hAnsi="Verdana" w:cs="굴림"/>
+          <w:b/>
+          <w:color w:val="333333"/>
+          <w:kern w:val="0"/>
+          <w:sz w:val="18"/>
+          <w:szCs w:val="18"/>
+        </w:rPr>
+        <w:t>install_apache</w:t>
+      </w:r>
+      <w:proofErr w:type="spellEnd"/>
     </w:p>
     <w:p>
       <w:pPr>
@@ -8277,12 +7532,14 @@
         <w:jc w:val="left"/>
         <w:rPr>
           <w:rFonts w:ascii="Verdana" w:eastAsia="굴림" w:hAnsi="Verdana" w:cs="굴림"/>
-          <w:color w:val="333333"/>
-          <w:kern w:val="0"/>
-          <w:sz w:val="18"/>
-          <w:szCs w:val="18"/>
-        </w:rPr>
-      </w:pPr>
+          <w:b/>
+          <w:color w:val="333333"/>
+          <w:kern w:val="0"/>
+          <w:sz w:val="18"/>
+          <w:szCs w:val="18"/>
+        </w:rPr>
+      </w:pPr>
+      <w:proofErr w:type="spellStart"/>
       <w:r>
         <w:rPr>
           <w:rFonts w:ascii="Verdana" w:eastAsia="굴림" w:hAnsi="Verdana" w:cs="굴림"/>
@@ -8293,9 +7550,9 @@
           <w:sz w:val="18"/>
           <w:szCs w:val="18"/>
         </w:rPr>
-        <w:t xml:space="preserve">tar </w:t>
-      </w:r>
-      <w:proofErr w:type="spellStart"/>
+        <w:t>wget</w:t>
+      </w:r>
+      <w:proofErr w:type="spellEnd"/>
       <w:r>
         <w:rPr>
           <w:rFonts w:ascii="Verdana" w:eastAsia="굴림" w:hAnsi="Verdana" w:cs="굴림"/>
@@ -8306,33 +7563,22 @@
           <w:sz w:val="18"/>
           <w:szCs w:val="18"/>
         </w:rPr>
-        <w:t>xzf</w:t>
-      </w:r>
-      <w:proofErr w:type="spellEnd"/>
-      <w:r>
-        <w:rPr>
-          <w:rFonts w:ascii="Verdana" w:eastAsia="굴림" w:hAnsi="Verdana" w:cs="굴림" w:hint="eastAsia"/>
-          <w:b/>
-          <w:bCs/>
-          <w:color w:val="333333"/>
-          <w:kern w:val="0"/>
-          <w:sz w:val="18"/>
-          <w:szCs w:val="18"/>
-        </w:rPr>
-        <w:t xml:space="preserve"> apr-</w:t>
-      </w:r>
-      <w:r>
-        <w:rPr>
-          <w:rFonts w:ascii="Verdana" w:eastAsia="굴림" w:hAnsi="Verdana" w:cs="굴림"/>
-          <w:b/>
-          <w:bCs/>
-          <w:color w:val="333333"/>
-          <w:kern w:val="0"/>
-          <w:sz w:val="18"/>
-          <w:szCs w:val="18"/>
-        </w:rPr>
-        <w:t>1.7.0.tar.gz</w:t>
-      </w:r>
+        <w:t xml:space="preserve"> </w:t>
+      </w:r>
+      <w:hyperlink r:id="rId20" w:history="1">
+        <w:r>
+          <w:rPr>
+            <w:rStyle w:val="a5"/>
+            <w:rFonts w:ascii="Verdana" w:eastAsia="굴림" w:hAnsi="Verdana" w:cs="굴림"/>
+            <w:b/>
+            <w:bCs/>
+            <w:kern w:val="0"/>
+            <w:sz w:val="18"/>
+            <w:szCs w:val="18"/>
+          </w:rPr>
+          <w:t>http://apache.mirror.cdnetworks.com//apr/apr-1.7.0.tar.gz</w:t>
+        </w:r>
+      </w:hyperlink>
     </w:p>
     <w:p>
       <w:pPr>
@@ -8357,9 +7603,10 @@
           <w:szCs w:val="18"/>
         </w:rPr>
       </w:pPr>
-      <w:r>
-        <w:rPr>
-          <w:rFonts w:ascii="Verdana" w:eastAsia="굴림" w:hAnsi="Verdana" w:cs="굴림" w:hint="eastAsia"/>
+      <w:proofErr w:type="spellStart"/>
+      <w:r>
+        <w:rPr>
+          <w:rFonts w:ascii="Verdana" w:eastAsia="굴림" w:hAnsi="Verdana" w:cs="굴림"/>
           <w:b/>
           <w:bCs/>
           <w:color w:val="333333"/>
@@ -8367,8 +7614,35 @@
           <w:sz w:val="18"/>
           <w:szCs w:val="18"/>
         </w:rPr>
-        <w:t>cd apr-1.7.0</w:t>
-      </w:r>
+        <w:t>wget</w:t>
+      </w:r>
+      <w:proofErr w:type="spellEnd"/>
+      <w:r>
+        <w:rPr>
+          <w:rFonts w:ascii="Verdana" w:eastAsia="굴림" w:hAnsi="Verdana" w:cs="굴림"/>
+          <w:b/>
+          <w:bCs/>
+          <w:color w:val="333333"/>
+          <w:kern w:val="0"/>
+          <w:sz w:val="18"/>
+          <w:szCs w:val="18"/>
+        </w:rPr>
+        <w:t xml:space="preserve"> </w:t>
+      </w:r>
+      <w:hyperlink r:id="rId21" w:history="1">
+        <w:r>
+          <w:rPr>
+            <w:rStyle w:val="a5"/>
+            <w:rFonts w:ascii="Verdana" w:eastAsia="굴림" w:hAnsi="Verdana" w:cs="굴림"/>
+            <w:b/>
+            <w:bCs/>
+            <w:kern w:val="0"/>
+            <w:sz w:val="18"/>
+            <w:szCs w:val="18"/>
+          </w:rPr>
+          <w:t>http://apache.tt.co.kr//apr/apr-util-1.6.1.tar.gz</w:t>
+        </w:r>
+      </w:hyperlink>
     </w:p>
     <w:p>
       <w:pPr>
@@ -8395,7 +7669,7 @@
       </w:pPr>
       <w:r>
         <w:rPr>
-          <w:rFonts w:ascii="Verdana" w:eastAsia="굴림" w:hAnsi="Verdana" w:cs="굴림" w:hint="eastAsia"/>
+          <w:rFonts w:ascii="Verdana" w:eastAsia="굴림" w:hAnsi="Verdana" w:cs="굴림"/>
           <w:b/>
           <w:bCs/>
           <w:color w:val="333333"/>
@@ -8403,8 +7677,9 @@
           <w:sz w:val="18"/>
           <w:szCs w:val="18"/>
         </w:rPr>
-        <w:t>컴파일</w:t>
-      </w:r>
+        <w:t xml:space="preserve">tar </w:t>
+      </w:r>
+      <w:proofErr w:type="spellStart"/>
       <w:r>
         <w:rPr>
           <w:rFonts w:ascii="Verdana" w:eastAsia="굴림" w:hAnsi="Verdana" w:cs="굴림"/>
@@ -8415,12 +7690,12 @@
           <w:sz w:val="18"/>
           <w:szCs w:val="18"/>
         </w:rPr>
-        <w:br/>
-      </w:r>
-      <w:proofErr w:type="gramStart"/>
-      <w:r>
-        <w:rPr>
-          <w:rFonts w:ascii="Verdana" w:eastAsia="굴림" w:hAnsi="Verdana" w:cs="굴림" w:hint="eastAsia"/>
+        <w:t>xzf</w:t>
+      </w:r>
+      <w:proofErr w:type="spellEnd"/>
+      <w:r>
+        <w:rPr>
+          <w:rFonts w:ascii="Verdana" w:eastAsia="굴림" w:hAnsi="Verdana" w:cs="굴림"/>
           <w:b/>
           <w:bCs/>
           <w:color w:val="333333"/>
@@ -8428,147 +7703,7 @@
           <w:sz w:val="18"/>
           <w:szCs w:val="18"/>
         </w:rPr>
-        <w:t>./</w:t>
-      </w:r>
-      <w:proofErr w:type="gramEnd"/>
-      <w:r>
-        <w:rPr>
-          <w:rFonts w:ascii="Verdana" w:eastAsia="굴림" w:hAnsi="Verdana" w:cs="굴림" w:hint="eastAsia"/>
-          <w:b/>
-          <w:bCs/>
-          <w:color w:val="333333"/>
-          <w:kern w:val="0"/>
-          <w:sz w:val="18"/>
-          <w:szCs w:val="18"/>
-        </w:rPr>
-        <w:t>configure --prefix=/</w:t>
-      </w:r>
-      <w:proofErr w:type="spellStart"/>
-      <w:r>
-        <w:rPr>
-          <w:rFonts w:ascii="Verdana" w:eastAsia="굴림" w:hAnsi="Verdana" w:cs="굴림" w:hint="eastAsia"/>
-          <w:b/>
-          <w:bCs/>
-          <w:color w:val="333333"/>
-          <w:kern w:val="0"/>
-          <w:sz w:val="18"/>
-          <w:szCs w:val="18"/>
-        </w:rPr>
-        <w:t>usr</w:t>
-      </w:r>
-      <w:proofErr w:type="spellEnd"/>
-      <w:r>
-        <w:rPr>
-          <w:rFonts w:ascii="Verdana" w:eastAsia="굴림" w:hAnsi="Verdana" w:cs="굴림" w:hint="eastAsia"/>
-          <w:b/>
-          <w:bCs/>
-          <w:color w:val="333333"/>
-          <w:kern w:val="0"/>
-          <w:sz w:val="18"/>
-          <w:szCs w:val="18"/>
-        </w:rPr>
-        <w:t>/local/</w:t>
-      </w:r>
-      <w:proofErr w:type="spellStart"/>
-      <w:r>
-        <w:rPr>
-          <w:rFonts w:ascii="Verdana" w:eastAsia="굴림" w:hAnsi="Verdana" w:cs="굴림" w:hint="eastAsia"/>
-          <w:b/>
-          <w:bCs/>
-          <w:color w:val="333333"/>
-          <w:kern w:val="0"/>
-          <w:sz w:val="18"/>
-          <w:szCs w:val="18"/>
-        </w:rPr>
-        <w:t>apr</w:t>
-      </w:r>
-      <w:proofErr w:type="spellEnd"/>
-      <w:r>
-        <w:rPr>
-          <w:rFonts w:ascii="Verdana" w:eastAsia="굴림" w:hAnsi="Verdana" w:cs="굴림"/>
-          <w:color w:val="333333"/>
-          <w:kern w:val="0"/>
-          <w:sz w:val="18"/>
-          <w:szCs w:val="18"/>
-        </w:rPr>
-        <w:br/>
-      </w:r>
-      <w:r>
-        <w:rPr>
-          <w:rFonts w:ascii="Verdana" w:eastAsia="굴림" w:hAnsi="Verdana" w:cs="굴림" w:hint="eastAsia"/>
-          <w:b/>
-          <w:color w:val="333333"/>
-          <w:kern w:val="0"/>
-          <w:sz w:val="18"/>
-          <w:szCs w:val="18"/>
-        </w:rPr>
-        <w:t>make &amp;&amp; make install</w:t>
-      </w:r>
-      <w:r>
-        <w:rPr>
-          <w:rFonts w:ascii="Verdana" w:eastAsia="굴림" w:hAnsi="Verdana" w:cs="굴림"/>
-          <w:color w:val="333333"/>
-          <w:kern w:val="0"/>
-          <w:sz w:val="18"/>
-          <w:szCs w:val="18"/>
-        </w:rPr>
-        <w:br/>
-      </w:r>
-    </w:p>
-    <w:p>
-      <w:pPr>
-        <w:pStyle w:val="a6"/>
-        <w:widowControl/>
-        <w:numPr>
-          <w:ilvl w:val="0"/>
-          <w:numId w:val="8"/>
-        </w:numPr>
-        <w:shd w:val="clear" w:color="auto" w:fill="FFFFFF"/>
-        <w:wordWrap/>
-        <w:autoSpaceDE/>
-        <w:autoSpaceDN/>
-        <w:spacing w:before="100" w:beforeAutospacing="1" w:after="100" w:afterAutospacing="1" w:line="240" w:lineRule="auto"/>
-        <w:ind w:leftChars="0"/>
-        <w:jc w:val="left"/>
-        <w:rPr>
-          <w:rFonts w:ascii="Verdana" w:eastAsia="굴림" w:hAnsi="Verdana" w:cs="굴림"/>
-          <w:color w:val="333333"/>
-          <w:kern w:val="0"/>
-          <w:sz w:val="18"/>
-          <w:szCs w:val="18"/>
-        </w:rPr>
-      </w:pPr>
-      <w:proofErr w:type="spellStart"/>
-      <w:r>
-        <w:rPr>
-          <w:rFonts w:ascii="Verdana" w:eastAsia="굴림" w:hAnsi="Verdana" w:cs="굴림" w:hint="eastAsia"/>
-          <w:color w:val="333333"/>
-          <w:kern w:val="0"/>
-          <w:sz w:val="18"/>
-          <w:szCs w:val="18"/>
-        </w:rPr>
-        <w:t>apr-util</w:t>
-      </w:r>
-      <w:proofErr w:type="spellEnd"/>
-      <w:r>
-        <w:rPr>
-          <w:rFonts w:ascii="Verdana" w:eastAsia="굴림" w:hAnsi="Verdana" w:cs="굴림" w:hint="eastAsia"/>
-          <w:color w:val="333333"/>
-          <w:kern w:val="0"/>
-          <w:sz w:val="18"/>
-          <w:szCs w:val="18"/>
-        </w:rPr>
-        <w:t xml:space="preserve"> </w:t>
-      </w:r>
-      <w:r>
-        <w:rPr>
-          <w:rFonts w:ascii="Verdana" w:eastAsia="굴림" w:hAnsi="Verdana" w:cs="굴림" w:hint="eastAsia"/>
-          <w:color w:val="333333"/>
-          <w:kern w:val="0"/>
-          <w:sz w:val="18"/>
-          <w:szCs w:val="18"/>
-        </w:rPr>
-        <w:t>설치</w:t>
+        <w:t xml:space="preserve"> apr-1.7.0.tar.gz</w:t>
       </w:r>
     </w:p>
     <w:p>
@@ -8588,379 +7723,49 @@
         <w:jc w:val="left"/>
         <w:rPr>
           <w:rFonts w:ascii="Verdana" w:eastAsia="굴림" w:hAnsi="Verdana" w:cs="굴림"/>
-          <w:b/>
-          <w:color w:val="333333"/>
-          <w:kern w:val="0"/>
-          <w:sz w:val="18"/>
-          <w:szCs w:val="18"/>
-        </w:rPr>
-      </w:pPr>
-      <w:r>
-        <w:rPr>
-          <w:rFonts w:ascii="Verdana" w:eastAsia="굴림" w:hAnsi="Verdana" w:cs="굴림"/>
-          <w:b/>
-          <w:color w:val="333333"/>
-          <w:kern w:val="0"/>
-          <w:sz w:val="18"/>
-          <w:szCs w:val="18"/>
-        </w:rPr>
-        <w:t>cd /</w:t>
+          <w:color w:val="333333"/>
+          <w:kern w:val="0"/>
+          <w:sz w:val="18"/>
+          <w:szCs w:val="18"/>
+        </w:rPr>
+      </w:pPr>
+      <w:r>
+        <w:rPr>
+          <w:rFonts w:ascii="Verdana" w:eastAsia="굴림" w:hAnsi="Verdana" w:cs="굴림"/>
+          <w:b/>
+          <w:bCs/>
+          <w:color w:val="333333"/>
+          <w:kern w:val="0"/>
+          <w:sz w:val="18"/>
+          <w:szCs w:val="18"/>
+        </w:rPr>
+        <w:t xml:space="preserve">tar </w:t>
       </w:r>
       <w:proofErr w:type="spellStart"/>
       <w:r>
         <w:rPr>
           <w:rFonts w:ascii="Verdana" w:eastAsia="굴림" w:hAnsi="Verdana" w:cs="굴림"/>
           <w:b/>
-          <w:color w:val="333333"/>
-          <w:kern w:val="0"/>
-          <w:sz w:val="18"/>
-          <w:szCs w:val="18"/>
-        </w:rPr>
-        <w:t>tmp</w:t>
+          <w:bCs/>
+          <w:color w:val="333333"/>
+          <w:kern w:val="0"/>
+          <w:sz w:val="18"/>
+          <w:szCs w:val="18"/>
+        </w:rPr>
+        <w:t>xzf</w:t>
       </w:r>
       <w:proofErr w:type="spellEnd"/>
       <w:r>
         <w:rPr>
           <w:rFonts w:ascii="Verdana" w:eastAsia="굴림" w:hAnsi="Verdana" w:cs="굴림"/>
           <w:b/>
-          <w:color w:val="333333"/>
-          <w:kern w:val="0"/>
-          <w:sz w:val="18"/>
-          <w:szCs w:val="18"/>
-        </w:rPr>
-        <w:t>/</w:t>
-      </w:r>
-      <w:proofErr w:type="spellStart"/>
-      <w:r>
-        <w:rPr>
-          <w:rFonts w:ascii="Verdana" w:eastAsia="굴림" w:hAnsi="Verdana" w:cs="굴림"/>
-          <w:b/>
-          <w:color w:val="333333"/>
-          <w:kern w:val="0"/>
-          <w:sz w:val="18"/>
-          <w:szCs w:val="18"/>
-        </w:rPr>
-        <w:t>install_apache</w:t>
-      </w:r>
-      <w:proofErr w:type="spellEnd"/>
-    </w:p>
-    <w:p>
-      <w:pPr>
-        <w:pStyle w:val="a6"/>
-        <w:widowControl/>
-        <w:numPr>
-          <w:ilvl w:val="1"/>
-          <w:numId w:val="8"/>
-        </w:numPr>
-        <w:shd w:val="clear" w:color="auto" w:fill="FFFFFF"/>
-        <w:wordWrap/>
-        <w:autoSpaceDE/>
-        <w:autoSpaceDN/>
-        <w:spacing w:before="100" w:beforeAutospacing="1" w:after="100" w:afterAutospacing="1" w:line="240" w:lineRule="auto"/>
-        <w:ind w:leftChars="0"/>
-        <w:jc w:val="left"/>
-        <w:rPr>
-          <w:rFonts w:ascii="Verdana" w:eastAsia="굴림" w:hAnsi="Verdana" w:cs="굴림"/>
-          <w:color w:val="333333"/>
-          <w:kern w:val="0"/>
-          <w:sz w:val="18"/>
-          <w:szCs w:val="18"/>
-        </w:rPr>
-      </w:pPr>
-      <w:proofErr w:type="spellStart"/>
-      <w:r>
-        <w:rPr>
-          <w:rFonts w:ascii="Verdana" w:eastAsia="굴림" w:hAnsi="Verdana" w:cs="굴림"/>
-          <w:b/>
           <w:bCs/>
           <w:color w:val="333333"/>
           <w:kern w:val="0"/>
           <w:sz w:val="18"/>
           <w:szCs w:val="18"/>
         </w:rPr>
-        <w:t>wget</w:t>
-      </w:r>
-      <w:proofErr w:type="spellEnd"/>
-      <w:r>
-        <w:rPr>
-          <w:rFonts w:ascii="Verdana" w:eastAsia="굴림" w:hAnsi="Verdana" w:cs="굴림"/>
-          <w:b/>
-          <w:bCs/>
-          <w:color w:val="333333"/>
-          <w:kern w:val="0"/>
-          <w:sz w:val="18"/>
-          <w:szCs w:val="18"/>
-        </w:rPr>
-        <w:t xml:space="preserve"> http://apache.tt.co.kr//apr/apr-util-1.6.1.tar.gz </w:t>
-      </w:r>
-    </w:p>
-    <w:p>
-      <w:pPr>
-        <w:pStyle w:val="a6"/>
-        <w:widowControl/>
-        <w:numPr>
-          <w:ilvl w:val="1"/>
-          <w:numId w:val="8"/>
-        </w:numPr>
-        <w:shd w:val="clear" w:color="auto" w:fill="FFFFFF"/>
-        <w:wordWrap/>
-        <w:autoSpaceDE/>
-        <w:autoSpaceDN/>
-        <w:spacing w:before="100" w:beforeAutospacing="1" w:after="100" w:afterAutospacing="1" w:line="240" w:lineRule="auto"/>
-        <w:ind w:leftChars="0"/>
-        <w:jc w:val="left"/>
-        <w:rPr>
-          <w:rFonts w:ascii="Verdana" w:eastAsia="굴림" w:hAnsi="Verdana" w:cs="굴림"/>
-          <w:color w:val="333333"/>
-          <w:kern w:val="0"/>
-          <w:sz w:val="18"/>
-          <w:szCs w:val="18"/>
-        </w:rPr>
-      </w:pPr>
-      <w:r>
-        <w:rPr>
-          <w:rFonts w:ascii="Verdana" w:eastAsia="굴림" w:hAnsi="Verdana" w:cs="굴림"/>
-          <w:b/>
-          <w:bCs/>
-          <w:color w:val="333333"/>
-          <w:kern w:val="0"/>
-          <w:sz w:val="18"/>
-          <w:szCs w:val="18"/>
-        </w:rPr>
-        <w:t xml:space="preserve">tar </w:t>
-      </w:r>
-      <w:proofErr w:type="spellStart"/>
-      <w:r>
-        <w:rPr>
-          <w:rFonts w:ascii="Verdana" w:eastAsia="굴림" w:hAnsi="Verdana" w:cs="굴림"/>
-          <w:b/>
-          <w:bCs/>
-          <w:color w:val="333333"/>
-          <w:kern w:val="0"/>
-          <w:sz w:val="18"/>
-          <w:szCs w:val="18"/>
-        </w:rPr>
-        <w:t>xzf</w:t>
-      </w:r>
-      <w:proofErr w:type="spellEnd"/>
-      <w:r>
-        <w:rPr>
-          <w:rFonts w:ascii="Verdana" w:eastAsia="굴림" w:hAnsi="Verdana" w:cs="굴림" w:hint="eastAsia"/>
-          <w:b/>
-          <w:bCs/>
-          <w:color w:val="333333"/>
-          <w:kern w:val="0"/>
-          <w:sz w:val="18"/>
-          <w:szCs w:val="18"/>
-        </w:rPr>
-        <w:t xml:space="preserve"> </w:t>
-      </w:r>
-      <w:r>
-        <w:rPr>
-          <w:rFonts w:ascii="Verdana" w:eastAsia="굴림" w:hAnsi="Verdana" w:cs="굴림"/>
-          <w:b/>
-          <w:bCs/>
-          <w:color w:val="333333"/>
-          <w:kern w:val="0"/>
-          <w:sz w:val="18"/>
-          <w:szCs w:val="18"/>
-        </w:rPr>
-        <w:t>apr-util-1.6.1.tar.gz</w:t>
-      </w:r>
-    </w:p>
-    <w:p>
-      <w:pPr>
-        <w:pStyle w:val="a6"/>
-        <w:widowControl/>
-        <w:numPr>
-          <w:ilvl w:val="1"/>
-          <w:numId w:val="8"/>
-        </w:numPr>
-        <w:shd w:val="clear" w:color="auto" w:fill="FFFFFF"/>
-        <w:wordWrap/>
-        <w:autoSpaceDE/>
-        <w:autoSpaceDN/>
-        <w:spacing w:before="100" w:beforeAutospacing="1" w:after="100" w:afterAutospacing="1" w:line="240" w:lineRule="auto"/>
-        <w:ind w:leftChars="0"/>
-        <w:jc w:val="left"/>
-        <w:rPr>
-          <w:rFonts w:ascii="Verdana" w:eastAsia="굴림" w:hAnsi="Verdana" w:cs="굴림"/>
-          <w:color w:val="333333"/>
-          <w:kern w:val="0"/>
-          <w:sz w:val="18"/>
-          <w:szCs w:val="18"/>
-        </w:rPr>
-      </w:pPr>
-      <w:r>
-        <w:rPr>
-          <w:rFonts w:ascii="Verdana" w:eastAsia="굴림" w:hAnsi="Verdana" w:cs="굴림" w:hint="eastAsia"/>
-          <w:b/>
-          <w:bCs/>
-          <w:color w:val="333333"/>
-          <w:kern w:val="0"/>
-          <w:sz w:val="18"/>
-          <w:szCs w:val="18"/>
-        </w:rPr>
-        <w:t xml:space="preserve">cd </w:t>
-      </w:r>
-      <w:r>
-        <w:rPr>
-          <w:rFonts w:ascii="Verdana" w:eastAsia="굴림" w:hAnsi="Verdana" w:cs="굴림"/>
-          <w:b/>
-          <w:bCs/>
-          <w:color w:val="333333"/>
-          <w:kern w:val="0"/>
-          <w:sz w:val="18"/>
-          <w:szCs w:val="18"/>
-        </w:rPr>
-        <w:t>apr-util-1.6.1</w:t>
-      </w:r>
-    </w:p>
-    <w:p>
-      <w:pPr>
-        <w:pStyle w:val="a6"/>
-        <w:widowControl/>
-        <w:numPr>
-          <w:ilvl w:val="1"/>
-          <w:numId w:val="8"/>
-        </w:numPr>
-        <w:shd w:val="clear" w:color="auto" w:fill="FFFFFF"/>
-        <w:wordWrap/>
-        <w:autoSpaceDE/>
-        <w:autoSpaceDN/>
-        <w:spacing w:before="100" w:beforeAutospacing="1" w:after="100" w:afterAutospacing="1" w:line="240" w:lineRule="auto"/>
-        <w:ind w:leftChars="0"/>
-        <w:jc w:val="left"/>
-        <w:rPr>
-          <w:rFonts w:ascii="Verdana" w:eastAsia="굴림" w:hAnsi="Verdana" w:cs="굴림"/>
-          <w:color w:val="333333"/>
-          <w:kern w:val="0"/>
-          <w:sz w:val="18"/>
-          <w:szCs w:val="18"/>
-        </w:rPr>
-      </w:pPr>
-      <w:r>
-        <w:rPr>
-          <w:rFonts w:ascii="Verdana" w:eastAsia="굴림" w:hAnsi="Verdana" w:cs="굴림" w:hint="eastAsia"/>
-          <w:b/>
-          <w:bCs/>
-          <w:color w:val="333333"/>
-          <w:kern w:val="0"/>
-          <w:sz w:val="18"/>
-          <w:szCs w:val="18"/>
-        </w:rPr>
-        <w:t>컴파일</w:t>
-      </w:r>
-      <w:r>
-        <w:rPr>
-          <w:rFonts w:ascii="Verdana" w:eastAsia="굴림" w:hAnsi="Verdana" w:cs="굴림"/>
-          <w:b/>
-          <w:bCs/>
-          <w:color w:val="333333"/>
-          <w:kern w:val="0"/>
-          <w:sz w:val="18"/>
-          <w:szCs w:val="18"/>
-        </w:rPr>
-        <w:br/>
-      </w:r>
-      <w:proofErr w:type="gramStart"/>
-      <w:r>
-        <w:rPr>
-          <w:rFonts w:ascii="Verdana" w:eastAsia="굴림" w:hAnsi="Verdana" w:cs="굴림" w:hint="eastAsia"/>
-          <w:b/>
-          <w:bCs/>
-          <w:color w:val="333333"/>
-          <w:kern w:val="0"/>
-          <w:sz w:val="18"/>
-          <w:szCs w:val="18"/>
-        </w:rPr>
-        <w:t>./</w:t>
-      </w:r>
-      <w:proofErr w:type="gramEnd"/>
-      <w:r>
-        <w:rPr>
-          <w:rFonts w:ascii="Verdana" w:eastAsia="굴림" w:hAnsi="Verdana" w:cs="굴림" w:hint="eastAsia"/>
-          <w:b/>
-          <w:bCs/>
-          <w:color w:val="333333"/>
-          <w:kern w:val="0"/>
-          <w:sz w:val="18"/>
-          <w:szCs w:val="18"/>
-        </w:rPr>
-        <w:t>configure --prefix=/</w:t>
-      </w:r>
-      <w:proofErr w:type="spellStart"/>
-      <w:r>
-        <w:rPr>
-          <w:rFonts w:ascii="Verdana" w:eastAsia="굴림" w:hAnsi="Verdana" w:cs="굴림" w:hint="eastAsia"/>
-          <w:b/>
-          <w:bCs/>
-          <w:color w:val="333333"/>
-          <w:kern w:val="0"/>
-          <w:sz w:val="18"/>
-          <w:szCs w:val="18"/>
-        </w:rPr>
-        <w:t>usr</w:t>
-      </w:r>
-      <w:proofErr w:type="spellEnd"/>
-      <w:r>
-        <w:rPr>
-          <w:rFonts w:ascii="Verdana" w:eastAsia="굴림" w:hAnsi="Verdana" w:cs="굴림" w:hint="eastAsia"/>
-          <w:b/>
-          <w:bCs/>
-          <w:color w:val="333333"/>
-          <w:kern w:val="0"/>
-          <w:sz w:val="18"/>
-          <w:szCs w:val="18"/>
-        </w:rPr>
-        <w:t>/local/</w:t>
-      </w:r>
-      <w:proofErr w:type="spellStart"/>
-      <w:r>
-        <w:rPr>
-          <w:rFonts w:ascii="Verdana" w:eastAsia="굴림" w:hAnsi="Verdana" w:cs="굴림" w:hint="eastAsia"/>
-          <w:b/>
-          <w:bCs/>
-          <w:color w:val="333333"/>
-          <w:kern w:val="0"/>
-          <w:sz w:val="18"/>
-          <w:szCs w:val="18"/>
-        </w:rPr>
-        <w:t>apr</w:t>
-      </w:r>
-      <w:r>
-        <w:rPr>
-          <w:rFonts w:ascii="Verdana" w:eastAsia="굴림" w:hAnsi="Verdana" w:cs="굴림"/>
-          <w:b/>
-          <w:bCs/>
-          <w:color w:val="333333"/>
-          <w:kern w:val="0"/>
-          <w:sz w:val="18"/>
-          <w:szCs w:val="18"/>
-        </w:rPr>
-        <w:t>-util</w:t>
-      </w:r>
-      <w:proofErr w:type="spellEnd"/>
-      <w:r>
-        <w:rPr>
-          <w:rFonts w:ascii="Verdana" w:eastAsia="굴림" w:hAnsi="Verdana" w:cs="굴림"/>
-          <w:color w:val="333333"/>
-          <w:kern w:val="0"/>
-          <w:sz w:val="18"/>
-          <w:szCs w:val="18"/>
-        </w:rPr>
-        <w:br/>
-      </w:r>
-      <w:r>
-        <w:rPr>
-          <w:rFonts w:ascii="Verdana" w:eastAsia="굴림" w:hAnsi="Verdana" w:cs="굴림" w:hint="eastAsia"/>
-          <w:b/>
-          <w:color w:val="333333"/>
-          <w:kern w:val="0"/>
-          <w:sz w:val="18"/>
-          <w:szCs w:val="18"/>
-        </w:rPr>
-        <w:t>make &amp;&amp; make install</w:t>
+        <w:t xml:space="preserve"> apr-util-1.6.1.tar.gz</w:t>
       </w:r>
     </w:p>
     <w:p>
@@ -8971,14 +7776,14 @@
           <w:numId w:val="35"/>
         </w:numPr>
       </w:pPr>
-      <w:bookmarkStart w:id="49" w:name="_Toc28005354"/>
+      <w:bookmarkStart w:id="48" w:name="_Toc28005354"/>
       <w:r>
         <w:rPr>
           <w:rFonts w:hint="eastAsia"/>
         </w:rPr>
         <w:t>PCRE 설치</w:t>
       </w:r>
-      <w:bookmarkEnd w:id="49"/>
+      <w:bookmarkEnd w:id="48"/>
       <w:r>
         <w:rPr>
           <w:rFonts w:hint="eastAsia"/>
@@ -9086,7 +7891,7 @@
           <w:sz w:val="18"/>
           <w:szCs w:val="18"/>
         </w:rPr>
-        <w:t>최종</w:t>
+        <w:t>다운로드</w:t>
       </w:r>
       <w:r>
         <w:rPr>
@@ -9108,7 +7913,7 @@
           <w:sz w:val="18"/>
           <w:szCs w:val="18"/>
         </w:rPr>
-        <w:t>버전</w:t>
+        <w:t>링크</w:t>
       </w:r>
       <w:r>
         <w:rPr>
@@ -9130,106 +7935,7 @@
           <w:sz w:val="18"/>
           <w:szCs w:val="18"/>
         </w:rPr>
-        <w:t>확인</w:t>
-      </w:r>
-      <w:r>
-        <w:rPr>
-          <w:rFonts w:ascii="Verdana" w:eastAsia="굴림" w:hAnsi="Verdana" w:cs="굴림" w:hint="eastAsia"/>
-          <w:bCs/>
-          <w:color w:val="333333"/>
-          <w:kern w:val="0"/>
-          <w:sz w:val="18"/>
-          <w:szCs w:val="18"/>
-        </w:rPr>
-        <w:t xml:space="preserve"> (</w:t>
-      </w:r>
-      <w:r>
-        <w:rPr>
-          <w:rFonts w:ascii="Verdana" w:eastAsia="굴림" w:hAnsi="Verdana" w:cs="굴림"/>
-          <w:bCs/>
-          <w:color w:val="333333"/>
-          <w:kern w:val="0"/>
-          <w:sz w:val="18"/>
-          <w:szCs w:val="18"/>
-        </w:rPr>
-        <w:t>1</w:t>
-      </w:r>
-      <w:r>
-        <w:rPr>
-          <w:rFonts w:ascii="Verdana" w:eastAsia="굴림" w:hAnsi="Verdana" w:cs="굴림" w:hint="eastAsia"/>
-          <w:bCs/>
-          <w:color w:val="333333"/>
-          <w:kern w:val="0"/>
-          <w:sz w:val="18"/>
-          <w:szCs w:val="18"/>
-        </w:rPr>
-        <w:t>버전</w:t>
-      </w:r>
-      <w:r>
-        <w:rPr>
-          <w:rFonts w:ascii="Verdana" w:eastAsia="굴림" w:hAnsi="Verdana" w:cs="굴림" w:hint="eastAsia"/>
-          <w:bCs/>
-          <w:color w:val="333333"/>
-          <w:kern w:val="0"/>
-          <w:sz w:val="18"/>
-          <w:szCs w:val="18"/>
-        </w:rPr>
-        <w:t>,</w:t>
-      </w:r>
-      <w:r>
-        <w:rPr>
-          <w:rFonts w:ascii="Verdana" w:eastAsia="굴림" w:hAnsi="Verdana" w:cs="굴림"/>
-          <w:bCs/>
-          <w:color w:val="333333"/>
-          <w:kern w:val="0"/>
-          <w:sz w:val="18"/>
-          <w:szCs w:val="18"/>
-        </w:rPr>
-        <w:t xml:space="preserve"> 2</w:t>
-      </w:r>
-      <w:r>
-        <w:rPr>
-          <w:rFonts w:ascii="Verdana" w:eastAsia="굴림" w:hAnsi="Verdana" w:cs="굴림" w:hint="eastAsia"/>
-          <w:bCs/>
-          <w:color w:val="333333"/>
-          <w:kern w:val="0"/>
-          <w:sz w:val="18"/>
-          <w:szCs w:val="18"/>
-        </w:rPr>
-        <w:t>버전</w:t>
-      </w:r>
-      <w:r>
-        <w:rPr>
-          <w:rFonts w:ascii="Verdana" w:eastAsia="굴림" w:hAnsi="Verdana" w:cs="굴림" w:hint="eastAsia"/>
-          <w:bCs/>
-          <w:color w:val="333333"/>
-          <w:kern w:val="0"/>
-          <w:sz w:val="18"/>
-          <w:szCs w:val="18"/>
-        </w:rPr>
-        <w:t xml:space="preserve"> </w:t>
-      </w:r>
-      <w:r>
-        <w:rPr>
-          <w:rFonts w:ascii="Verdana" w:eastAsia="굴림" w:hAnsi="Verdana" w:cs="굴림" w:hint="eastAsia"/>
-          <w:bCs/>
-          <w:color w:val="333333"/>
-          <w:kern w:val="0"/>
-          <w:sz w:val="18"/>
-          <w:szCs w:val="18"/>
-        </w:rPr>
-        <w:t>아님</w:t>
-      </w:r>
-      <w:r>
-        <w:rPr>
-          <w:rFonts w:ascii="Verdana" w:eastAsia="굴림" w:hAnsi="Verdana" w:cs="굴림" w:hint="eastAsia"/>
-          <w:bCs/>
-          <w:color w:val="333333"/>
-          <w:kern w:val="0"/>
-          <w:sz w:val="18"/>
-          <w:szCs w:val="18"/>
-        </w:rPr>
-        <w:t>)</w:t>
+        <w:t>복사</w:t>
       </w:r>
       <w:r>
         <w:rPr>
@@ -9326,7 +8032,7 @@
           <w:szCs w:val="18"/>
         </w:rPr>
       </w:pPr>
-      <w:bookmarkStart w:id="50" w:name="_Toc488328262"/>
+      <w:bookmarkStart w:id="49" w:name="_Toc488328262"/>
       <w:r>
         <w:rPr>
           <w:rFonts w:ascii="Verdana" w:eastAsia="굴림" w:hAnsi="Verdana" w:cs="굴림"/>
@@ -9576,7 +8282,7 @@
         <w:ind w:leftChars="0"/>
         <w:jc w:val="left"/>
         <w:rPr>
-          <w:rFonts w:ascii="Verdana" w:eastAsia="굴림" w:hAnsi="Verdana" w:cs="굴림" w:hint="eastAsia"/>
+          <w:rFonts w:ascii="Verdana" w:eastAsia="굴림" w:hAnsi="Verdana" w:cs="굴림"/>
           <w:color w:val="333333"/>
           <w:kern w:val="0"/>
           <w:sz w:val="18"/>
@@ -9593,7 +8299,6 @@
           <w:sz w:val="18"/>
           <w:szCs w:val="18"/>
         </w:rPr>
-        <w:lastRenderedPageBreak/>
         <w:t>컴파일</w:t>
       </w:r>
       <w:r>
@@ -9704,27 +8409,28 @@
           <w:numId w:val="35"/>
         </w:numPr>
       </w:pPr>
-      <w:bookmarkStart w:id="51" w:name="_Toc28005355"/>
+      <w:bookmarkStart w:id="50" w:name="_Toc28005355"/>
+      <w:bookmarkEnd w:id="49"/>
+      <w:r>
+        <w:lastRenderedPageBreak/>
+        <w:t xml:space="preserve">Apache </w:t>
+      </w:r>
+      <w:r>
+        <w:rPr>
+          <w:rFonts w:hint="eastAsia"/>
+        </w:rPr>
+        <w:t>HTTPD</w:t>
+      </w:r>
+      <w:r>
+        <w:t xml:space="preserve"> </w:t>
+      </w:r>
+      <w:r>
+        <w:rPr>
+          <w:rFonts w:hint="eastAsia"/>
+        </w:rPr>
+        <w:t>설치</w:t>
+      </w:r>
       <w:bookmarkEnd w:id="50"/>
-      <w:r>
-        <w:t xml:space="preserve">Apache </w:t>
-      </w:r>
-      <w:r>
-        <w:rPr>
-          <w:rFonts w:hint="eastAsia"/>
-        </w:rPr>
-        <w:t>HTTPD</w:t>
-      </w:r>
-      <w:r>
-        <w:t xml:space="preserve"> </w:t>
-      </w:r>
-      <w:r>
-        <w:rPr>
-          <w:rFonts w:hint="eastAsia"/>
-        </w:rPr>
-        <w:t>설치</w:t>
-      </w:r>
-      <w:bookmarkEnd w:id="51"/>
     </w:p>
     <w:p>
       <w:pPr>
@@ -10153,16 +8859,16 @@
         <w:jc w:val="left"/>
         <w:rPr>
           <w:rFonts w:ascii="Verdana" w:eastAsia="굴림" w:hAnsi="Verdana" w:cs="굴림"/>
-          <w:b/>
-          <w:color w:val="333333"/>
-          <w:kern w:val="0"/>
-          <w:sz w:val="18"/>
-          <w:szCs w:val="18"/>
-        </w:rPr>
-      </w:pPr>
-      <w:r>
-        <w:rPr>
-          <w:rFonts w:ascii="Verdana" w:eastAsia="굴림" w:hAnsi="Verdana" w:cs="굴림"/>
+          <w:color w:val="333333"/>
+          <w:kern w:val="0"/>
+          <w:sz w:val="18"/>
+          <w:szCs w:val="18"/>
+        </w:rPr>
+      </w:pPr>
+      <w:proofErr w:type="spellStart"/>
+      <w:r>
+        <w:rPr>
+          <w:rFonts w:ascii="Verdana" w:eastAsia="굴림" w:hAnsi="Verdana" w:cs="굴림" w:hint="eastAsia"/>
           <w:b/>
           <w:bCs/>
           <w:color w:val="333333"/>
@@ -10170,7 +8876,7 @@
           <w:sz w:val="18"/>
           <w:szCs w:val="18"/>
         </w:rPr>
-        <w:t>./configure</w:t>
+        <w:t>a</w:t>
       </w:r>
       <w:r>
         <w:rPr>
@@ -10182,18 +8888,156 @@
           <w:sz w:val="18"/>
           <w:szCs w:val="18"/>
         </w:rPr>
+        <w:t>pr</w:t>
+      </w:r>
+      <w:proofErr w:type="spellEnd"/>
+      <w:r>
+        <w:rPr>
+          <w:rFonts w:ascii="Verdana" w:eastAsia="굴림" w:hAnsi="Verdana" w:cs="굴림"/>
+          <w:b/>
+          <w:bCs/>
+          <w:color w:val="333333"/>
+          <w:kern w:val="0"/>
+          <w:sz w:val="18"/>
+          <w:szCs w:val="18"/>
+        </w:rPr>
+        <w:t xml:space="preserve">, </w:t>
+      </w:r>
+      <w:proofErr w:type="spellStart"/>
+      <w:r>
+        <w:rPr>
+          <w:rFonts w:ascii="Verdana" w:eastAsia="굴림" w:hAnsi="Verdana" w:cs="굴림"/>
+          <w:b/>
+          <w:bCs/>
+          <w:color w:val="333333"/>
+          <w:kern w:val="0"/>
+          <w:sz w:val="18"/>
+          <w:szCs w:val="18"/>
+        </w:rPr>
+        <w:t>apr-util</w:t>
+      </w:r>
+      <w:proofErr w:type="spellEnd"/>
+      <w:r>
+        <w:rPr>
+          <w:rFonts w:ascii="Verdana" w:eastAsia="굴림" w:hAnsi="Verdana" w:cs="굴림" w:hint="eastAsia"/>
+          <w:b/>
+          <w:bCs/>
+          <w:color w:val="333333"/>
+          <w:kern w:val="0"/>
+          <w:sz w:val="18"/>
+          <w:szCs w:val="18"/>
+        </w:rPr>
+        <w:t xml:space="preserve"> </w:t>
+      </w:r>
+      <w:r>
+        <w:rPr>
+          <w:rFonts w:ascii="Verdana" w:eastAsia="굴림" w:hAnsi="Verdana" w:cs="굴림" w:hint="eastAsia"/>
+          <w:b/>
+          <w:bCs/>
+          <w:color w:val="333333"/>
+          <w:kern w:val="0"/>
+          <w:sz w:val="18"/>
+          <w:szCs w:val="18"/>
+        </w:rPr>
+        <w:t>폴더를</w:t>
+      </w:r>
+      <w:r>
+        <w:rPr>
+          <w:rFonts w:ascii="Verdana" w:eastAsia="굴림" w:hAnsi="Verdana" w:cs="굴림" w:hint="eastAsia"/>
+          <w:b/>
+          <w:bCs/>
+          <w:color w:val="333333"/>
+          <w:kern w:val="0"/>
+          <w:sz w:val="18"/>
+          <w:szCs w:val="18"/>
+        </w:rPr>
+        <w:t xml:space="preserve"> </w:t>
+      </w:r>
+      <w:proofErr w:type="spellStart"/>
+      <w:r>
+        <w:rPr>
+          <w:rFonts w:ascii="Verdana" w:eastAsia="굴림" w:hAnsi="Verdana" w:cs="굴림"/>
+          <w:b/>
+          <w:bCs/>
+          <w:color w:val="333333"/>
+          <w:kern w:val="0"/>
+          <w:sz w:val="18"/>
+          <w:szCs w:val="18"/>
+        </w:rPr>
+        <w:t>srclib</w:t>
+      </w:r>
+      <w:proofErr w:type="spellEnd"/>
+      <w:r>
+        <w:rPr>
+          <w:rFonts w:ascii="Verdana" w:eastAsia="굴림" w:hAnsi="Verdana" w:cs="굴림" w:hint="eastAsia"/>
+          <w:b/>
+          <w:bCs/>
+          <w:color w:val="333333"/>
+          <w:kern w:val="0"/>
+          <w:sz w:val="18"/>
+          <w:szCs w:val="18"/>
+        </w:rPr>
+        <w:t>로</w:t>
+      </w:r>
+      <w:r>
+        <w:rPr>
+          <w:rFonts w:ascii="Verdana" w:eastAsia="굴림" w:hAnsi="Verdana" w:cs="굴림" w:hint="eastAsia"/>
+          <w:b/>
+          <w:bCs/>
+          <w:color w:val="333333"/>
+          <w:kern w:val="0"/>
+          <w:sz w:val="18"/>
+          <w:szCs w:val="18"/>
+        </w:rPr>
+        <w:t xml:space="preserve"> </w:t>
+      </w:r>
+      <w:r>
+        <w:rPr>
+          <w:rFonts w:ascii="Verdana" w:eastAsia="굴림" w:hAnsi="Verdana" w:cs="굴림" w:hint="eastAsia"/>
+          <w:b/>
+          <w:bCs/>
+          <w:color w:val="333333"/>
+          <w:kern w:val="0"/>
+          <w:sz w:val="18"/>
+          <w:szCs w:val="18"/>
+        </w:rPr>
+        <w:t>이동</w:t>
+      </w:r>
+      <w:r>
+        <w:rPr>
+          <w:rFonts w:ascii="Verdana" w:eastAsia="굴림" w:hAnsi="Verdana" w:cs="굴림"/>
+          <w:b/>
+          <w:bCs/>
+          <w:color w:val="333333"/>
+          <w:kern w:val="0"/>
+          <w:sz w:val="18"/>
+          <w:szCs w:val="18"/>
+        </w:rPr>
         <w:br/>
       </w:r>
-      <w:r>
-        <w:rPr>
-          <w:rFonts w:ascii="Verdana" w:eastAsia="굴림" w:hAnsi="Verdana" w:cs="굴림"/>
-          <w:b/>
-          <w:color w:val="333333"/>
-          <w:kern w:val="0"/>
-          <w:sz w:val="18"/>
-          <w:szCs w:val="18"/>
-        </w:rPr>
-        <w:t>--prefix=/</w:t>
+      <w:proofErr w:type="gramStart"/>
+      <w:r>
+        <w:rPr>
+          <w:rFonts w:ascii="Verdana" w:eastAsia="굴림" w:hAnsi="Verdana" w:cs="굴림"/>
+          <w:b/>
+          <w:color w:val="333333"/>
+          <w:kern w:val="0"/>
+          <w:sz w:val="18"/>
+          <w:szCs w:val="18"/>
+        </w:rPr>
+        <w:t>mv ..</w:t>
+      </w:r>
+      <w:proofErr w:type="gramEnd"/>
+      <w:r>
+        <w:rPr>
+          <w:rFonts w:ascii="Verdana" w:eastAsia="굴림" w:hAnsi="Verdana" w:cs="굴림"/>
+          <w:b/>
+          <w:color w:val="333333"/>
+          <w:kern w:val="0"/>
+          <w:sz w:val="18"/>
+          <w:szCs w:val="18"/>
+        </w:rPr>
+        <w:t xml:space="preserve">/apr-1.7.0 </w:t>
       </w:r>
       <w:proofErr w:type="spellStart"/>
       <w:r>
@@ -10205,7 +9049,7 @@
           <w:sz w:val="18"/>
           <w:szCs w:val="18"/>
         </w:rPr>
-        <w:t>usr</w:t>
+        <w:t>srclib</w:t>
       </w:r>
       <w:proofErr w:type="spellEnd"/>
       <w:r>
@@ -10217,7 +9061,7 @@
           <w:sz w:val="18"/>
           <w:szCs w:val="18"/>
         </w:rPr>
-        <w:t>/local/</w:t>
+        <w:t>/</w:t>
       </w:r>
       <w:proofErr w:type="spellStart"/>
       <w:r>
@@ -10229,7 +9073,7 @@
           <w:sz w:val="18"/>
           <w:szCs w:val="18"/>
         </w:rPr>
-        <w:t>httpd</w:t>
+        <w:t>apr</w:t>
       </w:r>
       <w:proofErr w:type="spellEnd"/>
       <w:r>
@@ -10241,31 +9085,8 @@
           <w:sz w:val="18"/>
           <w:szCs w:val="18"/>
         </w:rPr>
-        <w:t xml:space="preserve"> \</w:t>
-      </w:r>
-      <w:r>
-        <w:rPr>
-          <w:rFonts w:ascii="Verdana" w:eastAsia="굴림" w:hAnsi="Verdana" w:cs="굴림"/>
-          <w:b/>
-          <w:color w:val="333333"/>
-          <w:kern w:val="0"/>
-          <w:sz w:val="18"/>
-          <w:szCs w:val="18"/>
-        </w:rPr>
         <w:br/>
-        <w:t>--enable-unique-id --enable-so --enable-proxy --enable-mods-shared=all \</w:t>
-      </w:r>
-      <w:r>
-        <w:rPr>
-          <w:rFonts w:ascii="Verdana" w:eastAsia="굴림" w:hAnsi="Verdana" w:cs="굴림"/>
-          <w:b/>
-          <w:color w:val="333333"/>
-          <w:kern w:val="0"/>
-          <w:sz w:val="18"/>
-          <w:szCs w:val="18"/>
-        </w:rPr>
-        <w:br/>
-        <w:t>--with-</w:t>
+        <w:t xml:space="preserve">mv ../apr-util-1.6.1 </w:t>
       </w:r>
       <w:proofErr w:type="spellStart"/>
       <w:r>
@@ -10277,7 +9098,7 @@
           <w:sz w:val="18"/>
           <w:szCs w:val="18"/>
         </w:rPr>
-        <w:t>mpm</w:t>
+        <w:t>srclib</w:t>
       </w:r>
       <w:proofErr w:type="spellEnd"/>
       <w:r>
@@ -10289,7 +9110,7 @@
           <w:sz w:val="18"/>
           <w:szCs w:val="18"/>
         </w:rPr>
-        <w:t>=worker --enable-</w:t>
+        <w:t>/</w:t>
       </w:r>
       <w:proofErr w:type="spellStart"/>
       <w:r>
@@ -10301,281 +9122,7 @@
           <w:sz w:val="18"/>
           <w:szCs w:val="18"/>
         </w:rPr>
-        <w:t>mpms</w:t>
-      </w:r>
-      <w:proofErr w:type="spellEnd"/>
-      <w:r>
-        <w:rPr>
-          <w:rFonts w:ascii="Verdana" w:eastAsia="굴림" w:hAnsi="Verdana" w:cs="굴림"/>
-          <w:b/>
-          <w:color w:val="333333"/>
-          <w:kern w:val="0"/>
-          <w:sz w:val="18"/>
-          <w:szCs w:val="18"/>
-        </w:rPr>
-        <w:t>-shared=all \</w:t>
-      </w:r>
-      <w:r>
-        <w:rPr>
-          <w:rFonts w:ascii="Verdana" w:eastAsia="굴림" w:hAnsi="Verdana" w:cs="굴림"/>
-          <w:b/>
-          <w:color w:val="333333"/>
-          <w:kern w:val="0"/>
-          <w:sz w:val="18"/>
-          <w:szCs w:val="18"/>
-        </w:rPr>
-        <w:br/>
-        <w:t>--with-</w:t>
-      </w:r>
-      <w:proofErr w:type="spellStart"/>
-      <w:r>
-        <w:rPr>
-          <w:rFonts w:ascii="Verdana" w:eastAsia="굴림" w:hAnsi="Verdana" w:cs="굴림"/>
-          <w:b/>
-          <w:color w:val="333333"/>
-          <w:kern w:val="0"/>
-          <w:sz w:val="18"/>
-          <w:szCs w:val="18"/>
-        </w:rPr>
-        <w:t>apr</w:t>
-      </w:r>
-      <w:proofErr w:type="spellEnd"/>
-      <w:r>
-        <w:rPr>
-          <w:rFonts w:ascii="Verdana" w:eastAsia="굴림" w:hAnsi="Verdana" w:cs="굴림"/>
-          <w:b/>
-          <w:color w:val="333333"/>
-          <w:kern w:val="0"/>
-          <w:sz w:val="18"/>
-          <w:szCs w:val="18"/>
-        </w:rPr>
-        <w:t>=/</w:t>
-      </w:r>
-      <w:proofErr w:type="spellStart"/>
-      <w:r>
-        <w:rPr>
-          <w:rFonts w:ascii="Verdana" w:eastAsia="굴림" w:hAnsi="Verdana" w:cs="굴림"/>
-          <w:b/>
-          <w:color w:val="333333"/>
-          <w:kern w:val="0"/>
-          <w:sz w:val="18"/>
-          <w:szCs w:val="18"/>
-        </w:rPr>
-        <w:t>usr</w:t>
-      </w:r>
-      <w:proofErr w:type="spellEnd"/>
-      <w:r>
-        <w:rPr>
-          <w:rFonts w:ascii="Verdana" w:eastAsia="굴림" w:hAnsi="Verdana" w:cs="굴림"/>
-          <w:b/>
-          <w:color w:val="333333"/>
-          <w:kern w:val="0"/>
-          <w:sz w:val="18"/>
-          <w:szCs w:val="18"/>
-        </w:rPr>
-        <w:t>/local/</w:t>
-      </w:r>
-      <w:proofErr w:type="spellStart"/>
-      <w:r>
-        <w:rPr>
-          <w:rFonts w:ascii="Verdana" w:eastAsia="굴림" w:hAnsi="Verdana" w:cs="굴림"/>
-          <w:b/>
-          <w:color w:val="333333"/>
-          <w:kern w:val="0"/>
-          <w:sz w:val="18"/>
-          <w:szCs w:val="18"/>
-        </w:rPr>
-        <w:t>apr</w:t>
-      </w:r>
-      <w:proofErr w:type="spellEnd"/>
-      <w:r>
-        <w:rPr>
-          <w:rFonts w:ascii="Verdana" w:eastAsia="굴림" w:hAnsi="Verdana" w:cs="굴림"/>
-          <w:b/>
-          <w:color w:val="333333"/>
-          <w:kern w:val="0"/>
-          <w:sz w:val="18"/>
-          <w:szCs w:val="18"/>
-        </w:rPr>
-        <w:t xml:space="preserve"> --with-</w:t>
-      </w:r>
-      <w:proofErr w:type="spellStart"/>
-      <w:r>
-        <w:rPr>
-          <w:rFonts w:ascii="Verdana" w:eastAsia="굴림" w:hAnsi="Verdana" w:cs="굴림"/>
-          <w:b/>
-          <w:color w:val="333333"/>
-          <w:kern w:val="0"/>
-          <w:sz w:val="18"/>
-          <w:szCs w:val="18"/>
-        </w:rPr>
-        <w:t>apr</w:t>
-      </w:r>
-      <w:proofErr w:type="spellEnd"/>
-      <w:r>
-        <w:rPr>
-          <w:rFonts w:ascii="Verdana" w:eastAsia="굴림" w:hAnsi="Verdana" w:cs="굴림"/>
-          <w:b/>
-          <w:color w:val="333333"/>
-          <w:kern w:val="0"/>
-          <w:sz w:val="18"/>
-          <w:szCs w:val="18"/>
-        </w:rPr>
-        <w:t>-</w:t>
-      </w:r>
-      <w:proofErr w:type="spellStart"/>
-      <w:r>
-        <w:rPr>
-          <w:rFonts w:ascii="Verdana" w:eastAsia="굴림" w:hAnsi="Verdana" w:cs="굴림"/>
-          <w:b/>
-          <w:color w:val="333333"/>
-          <w:kern w:val="0"/>
-          <w:sz w:val="18"/>
-          <w:szCs w:val="18"/>
-        </w:rPr>
-        <w:t>util</w:t>
-      </w:r>
-      <w:proofErr w:type="spellEnd"/>
-      <w:r>
-        <w:rPr>
-          <w:rFonts w:ascii="Verdana" w:eastAsia="굴림" w:hAnsi="Verdana" w:cs="굴림"/>
-          <w:b/>
-          <w:color w:val="333333"/>
-          <w:kern w:val="0"/>
-          <w:sz w:val="18"/>
-          <w:szCs w:val="18"/>
-        </w:rPr>
-        <w:t>=/</w:t>
-      </w:r>
-      <w:proofErr w:type="spellStart"/>
-      <w:r>
-        <w:rPr>
-          <w:rFonts w:ascii="Verdana" w:eastAsia="굴림" w:hAnsi="Verdana" w:cs="굴림"/>
-          <w:b/>
-          <w:color w:val="333333"/>
-          <w:kern w:val="0"/>
-          <w:sz w:val="18"/>
-          <w:szCs w:val="18"/>
-        </w:rPr>
-        <w:t>usr</w:t>
-      </w:r>
-      <w:proofErr w:type="spellEnd"/>
-      <w:r>
-        <w:rPr>
-          <w:rFonts w:ascii="Verdana" w:eastAsia="굴림" w:hAnsi="Verdana" w:cs="굴림"/>
-          <w:b/>
-          <w:color w:val="333333"/>
-          <w:kern w:val="0"/>
-          <w:sz w:val="18"/>
-          <w:szCs w:val="18"/>
-        </w:rPr>
-        <w:t>/local/</w:t>
-      </w:r>
-      <w:proofErr w:type="spellStart"/>
-      <w:r>
-        <w:rPr>
-          <w:rFonts w:ascii="Verdana" w:eastAsia="굴림" w:hAnsi="Verdana" w:cs="굴림"/>
-          <w:b/>
-          <w:color w:val="333333"/>
-          <w:kern w:val="0"/>
-          <w:sz w:val="18"/>
-          <w:szCs w:val="18"/>
-        </w:rPr>
         <w:t>apr-util</w:t>
-      </w:r>
-      <w:proofErr w:type="spellEnd"/>
-      <w:r>
-        <w:rPr>
-          <w:rFonts w:ascii="Verdana" w:eastAsia="굴림" w:hAnsi="Verdana" w:cs="굴림"/>
-          <w:b/>
-          <w:color w:val="333333"/>
-          <w:kern w:val="0"/>
-          <w:sz w:val="18"/>
-          <w:szCs w:val="18"/>
-        </w:rPr>
-        <w:t xml:space="preserve"> \</w:t>
-      </w:r>
-      <w:r>
-        <w:rPr>
-          <w:rFonts w:ascii="Verdana" w:eastAsia="굴림" w:hAnsi="Verdana" w:cs="굴림"/>
-          <w:b/>
-          <w:color w:val="333333"/>
-          <w:kern w:val="0"/>
-          <w:sz w:val="18"/>
-          <w:szCs w:val="18"/>
-        </w:rPr>
-        <w:br/>
-      </w:r>
-      <w:r>
-        <w:rPr>
-          <w:rFonts w:ascii="Verdana" w:eastAsia="굴림" w:hAnsi="Verdana" w:cs="굴림"/>
-          <w:b/>
-          <w:color w:val="333333"/>
-          <w:kern w:val="0"/>
-          <w:sz w:val="18"/>
-          <w:szCs w:val="18"/>
-        </w:rPr>
-        <w:t>--with-</w:t>
-      </w:r>
-      <w:proofErr w:type="spellStart"/>
-      <w:r>
-        <w:rPr>
-          <w:rFonts w:ascii="Verdana" w:eastAsia="굴림" w:hAnsi="Verdana" w:cs="굴림"/>
-          <w:b/>
-          <w:color w:val="333333"/>
-          <w:kern w:val="0"/>
-          <w:sz w:val="18"/>
-          <w:szCs w:val="18"/>
-        </w:rPr>
-        <w:t>pcre</w:t>
-      </w:r>
-      <w:proofErr w:type="spellEnd"/>
-      <w:r>
-        <w:rPr>
-          <w:rFonts w:ascii="Verdana" w:eastAsia="굴림" w:hAnsi="Verdana" w:cs="굴림"/>
-          <w:b/>
-          <w:color w:val="333333"/>
-          <w:kern w:val="0"/>
-          <w:sz w:val="18"/>
-          <w:szCs w:val="18"/>
-        </w:rPr>
-        <w:t>=/</w:t>
-      </w:r>
-      <w:proofErr w:type="spellStart"/>
-      <w:r>
-        <w:rPr>
-          <w:rFonts w:ascii="Verdana" w:eastAsia="굴림" w:hAnsi="Verdana" w:cs="굴림"/>
-          <w:b/>
-          <w:color w:val="333333"/>
-          <w:kern w:val="0"/>
-          <w:sz w:val="18"/>
-          <w:szCs w:val="18"/>
-        </w:rPr>
-        <w:t>usr</w:t>
-      </w:r>
-      <w:proofErr w:type="spellEnd"/>
-      <w:r>
-        <w:rPr>
-          <w:rFonts w:ascii="Verdana" w:eastAsia="굴림" w:hAnsi="Verdana" w:cs="굴림"/>
-          <w:b/>
-          <w:color w:val="333333"/>
-          <w:kern w:val="0"/>
-          <w:sz w:val="18"/>
-          <w:szCs w:val="18"/>
-        </w:rPr>
-        <w:t>/local/</w:t>
-      </w:r>
-      <w:proofErr w:type="spellStart"/>
-      <w:r>
-        <w:rPr>
-          <w:rFonts w:ascii="Verdana" w:eastAsia="굴림" w:hAnsi="Verdana" w:cs="굴림"/>
-          <w:b/>
-          <w:color w:val="333333"/>
-          <w:kern w:val="0"/>
-          <w:sz w:val="18"/>
-          <w:szCs w:val="18"/>
-        </w:rPr>
-        <w:t>pcre</w:t>
       </w:r>
       <w:proofErr w:type="spellEnd"/>
     </w:p>
@@ -10607,6 +9154,409 @@
         <w:rPr>
           <w:rFonts w:ascii="Verdana" w:eastAsia="굴림" w:hAnsi="Verdana" w:cs="굴림"/>
           <w:b/>
+          <w:bCs/>
+          <w:color w:val="333333"/>
+          <w:kern w:val="0"/>
+          <w:sz w:val="18"/>
+          <w:szCs w:val="18"/>
+        </w:rPr>
+        <w:t>./configure</w:t>
+      </w:r>
+      <w:r>
+        <w:rPr>
+          <w:rFonts w:ascii="Verdana" w:eastAsia="굴림" w:hAnsi="Verdana" w:cs="굴림"/>
+          <w:b/>
+          <w:bCs/>
+          <w:color w:val="333333"/>
+          <w:kern w:val="0"/>
+          <w:sz w:val="18"/>
+          <w:szCs w:val="18"/>
+        </w:rPr>
+        <w:t xml:space="preserve"> \</w:t>
+      </w:r>
+      <w:r>
+        <w:rPr>
+          <w:rFonts w:ascii="Verdana" w:eastAsia="굴림" w:hAnsi="Verdana" w:cs="굴림"/>
+          <w:b/>
+          <w:bCs/>
+          <w:color w:val="333333"/>
+          <w:kern w:val="0"/>
+          <w:sz w:val="18"/>
+          <w:szCs w:val="18"/>
+        </w:rPr>
+        <w:br/>
+      </w:r>
+      <w:r>
+        <w:rPr>
+          <w:rFonts w:ascii="Verdana" w:eastAsia="굴림" w:hAnsi="Verdana" w:cs="굴림"/>
+          <w:b/>
+          <w:color w:val="333333"/>
+          <w:kern w:val="0"/>
+          <w:sz w:val="18"/>
+          <w:szCs w:val="18"/>
+        </w:rPr>
+        <w:t>--prefix=/</w:t>
+      </w:r>
+      <w:proofErr w:type="spellStart"/>
+      <w:r>
+        <w:rPr>
+          <w:rFonts w:ascii="Verdana" w:eastAsia="굴림" w:hAnsi="Verdana" w:cs="굴림"/>
+          <w:b/>
+          <w:color w:val="333333"/>
+          <w:kern w:val="0"/>
+          <w:sz w:val="18"/>
+          <w:szCs w:val="18"/>
+        </w:rPr>
+        <w:t>usr</w:t>
+      </w:r>
+      <w:proofErr w:type="spellEnd"/>
+      <w:r>
+        <w:rPr>
+          <w:rFonts w:ascii="Verdana" w:eastAsia="굴림" w:hAnsi="Verdana" w:cs="굴림"/>
+          <w:b/>
+          <w:color w:val="333333"/>
+          <w:kern w:val="0"/>
+          <w:sz w:val="18"/>
+          <w:szCs w:val="18"/>
+        </w:rPr>
+        <w:t>/local/</w:t>
+      </w:r>
+      <w:proofErr w:type="spellStart"/>
+      <w:r>
+        <w:rPr>
+          <w:rFonts w:ascii="Verdana" w:eastAsia="굴림" w:hAnsi="Verdana" w:cs="굴림"/>
+          <w:b/>
+          <w:color w:val="333333"/>
+          <w:kern w:val="0"/>
+          <w:sz w:val="18"/>
+          <w:szCs w:val="18"/>
+        </w:rPr>
+        <w:t>httpd</w:t>
+      </w:r>
+      <w:proofErr w:type="spellEnd"/>
+      <w:r>
+        <w:rPr>
+          <w:rFonts w:ascii="Verdana" w:eastAsia="굴림" w:hAnsi="Verdana" w:cs="굴림"/>
+          <w:b/>
+          <w:color w:val="333333"/>
+          <w:kern w:val="0"/>
+          <w:sz w:val="18"/>
+          <w:szCs w:val="18"/>
+        </w:rPr>
+        <w:t xml:space="preserve"> \</w:t>
+      </w:r>
+      <w:r>
+        <w:rPr>
+          <w:rFonts w:ascii="Verdana" w:eastAsia="굴림" w:hAnsi="Verdana" w:cs="굴림"/>
+          <w:b/>
+          <w:color w:val="333333"/>
+          <w:kern w:val="0"/>
+          <w:sz w:val="18"/>
+          <w:szCs w:val="18"/>
+        </w:rPr>
+        <w:br/>
+        <w:t>--enable-unique-id --enable-so --enable-proxy --enable-mods-shared=all \</w:t>
+      </w:r>
+      <w:r>
+        <w:rPr>
+          <w:rFonts w:ascii="Verdana" w:eastAsia="굴림" w:hAnsi="Verdana" w:cs="굴림"/>
+          <w:b/>
+          <w:color w:val="333333"/>
+          <w:kern w:val="0"/>
+          <w:sz w:val="18"/>
+          <w:szCs w:val="18"/>
+        </w:rPr>
+        <w:br/>
+        <w:t>--with-</w:t>
+      </w:r>
+      <w:proofErr w:type="spellStart"/>
+      <w:r>
+        <w:rPr>
+          <w:rFonts w:ascii="Verdana" w:eastAsia="굴림" w:hAnsi="Verdana" w:cs="굴림"/>
+          <w:b/>
+          <w:color w:val="333333"/>
+          <w:kern w:val="0"/>
+          <w:sz w:val="18"/>
+          <w:szCs w:val="18"/>
+        </w:rPr>
+        <w:t>mpm</w:t>
+      </w:r>
+      <w:proofErr w:type="spellEnd"/>
+      <w:r>
+        <w:rPr>
+          <w:rFonts w:ascii="Verdana" w:eastAsia="굴림" w:hAnsi="Verdana" w:cs="굴림"/>
+          <w:b/>
+          <w:color w:val="333333"/>
+          <w:kern w:val="0"/>
+          <w:sz w:val="18"/>
+          <w:szCs w:val="18"/>
+        </w:rPr>
+        <w:t>=worker --enable-</w:t>
+      </w:r>
+      <w:proofErr w:type="spellStart"/>
+      <w:r>
+        <w:rPr>
+          <w:rFonts w:ascii="Verdana" w:eastAsia="굴림" w:hAnsi="Verdana" w:cs="굴림"/>
+          <w:b/>
+          <w:color w:val="333333"/>
+          <w:kern w:val="0"/>
+          <w:sz w:val="18"/>
+          <w:szCs w:val="18"/>
+        </w:rPr>
+        <w:t>mpms</w:t>
+      </w:r>
+      <w:proofErr w:type="spellEnd"/>
+      <w:r>
+        <w:rPr>
+          <w:rFonts w:ascii="Verdana" w:eastAsia="굴림" w:hAnsi="Verdana" w:cs="굴림"/>
+          <w:b/>
+          <w:color w:val="333333"/>
+          <w:kern w:val="0"/>
+          <w:sz w:val="18"/>
+          <w:szCs w:val="18"/>
+        </w:rPr>
+        <w:t>-shared=all \</w:t>
+      </w:r>
+      <w:r>
+        <w:rPr>
+          <w:rFonts w:ascii="Verdana" w:eastAsia="굴림" w:hAnsi="Verdana" w:cs="굴림"/>
+          <w:b/>
+          <w:color w:val="333333"/>
+          <w:kern w:val="0"/>
+          <w:sz w:val="18"/>
+          <w:szCs w:val="18"/>
+        </w:rPr>
+        <w:br/>
+        <w:t>--with-</w:t>
+      </w:r>
+      <w:r>
+        <w:rPr>
+          <w:rFonts w:ascii="Verdana" w:eastAsia="굴림" w:hAnsi="Verdana" w:cs="굴림" w:hint="eastAsia"/>
+          <w:b/>
+          <w:color w:val="333333"/>
+          <w:kern w:val="0"/>
+          <w:sz w:val="18"/>
+          <w:szCs w:val="18"/>
+        </w:rPr>
+        <w:t>included-</w:t>
+      </w:r>
+      <w:proofErr w:type="spellStart"/>
+      <w:r>
+        <w:rPr>
+          <w:rFonts w:ascii="Verdana" w:eastAsia="굴림" w:hAnsi="Verdana" w:cs="굴림"/>
+          <w:b/>
+          <w:color w:val="333333"/>
+          <w:kern w:val="0"/>
+          <w:sz w:val="18"/>
+          <w:szCs w:val="18"/>
+        </w:rPr>
+        <w:t>apr</w:t>
+      </w:r>
+      <w:proofErr w:type="spellEnd"/>
+      <w:r>
+        <w:rPr>
+          <w:rFonts w:ascii="Verdana" w:eastAsia="굴림" w:hAnsi="Verdana" w:cs="굴림"/>
+          <w:b/>
+          <w:color w:val="333333"/>
+          <w:kern w:val="0"/>
+          <w:sz w:val="18"/>
+          <w:szCs w:val="18"/>
+        </w:rPr>
+        <w:t xml:space="preserve"> </w:t>
+      </w:r>
+      <w:r>
+        <w:rPr>
+          <w:rFonts w:ascii="Verdana" w:eastAsia="굴림" w:hAnsi="Verdana" w:cs="굴림"/>
+          <w:b/>
+          <w:color w:val="333333"/>
+          <w:kern w:val="0"/>
+          <w:sz w:val="18"/>
+          <w:szCs w:val="18"/>
+        </w:rPr>
+        <w:t>--with-</w:t>
+      </w:r>
+      <w:r>
+        <w:rPr>
+          <w:rFonts w:ascii="Verdana" w:eastAsia="굴림" w:hAnsi="Verdana" w:cs="굴림"/>
+          <w:b/>
+          <w:color w:val="333333"/>
+          <w:kern w:val="0"/>
+          <w:sz w:val="18"/>
+          <w:szCs w:val="18"/>
+        </w:rPr>
+        <w:t>included-</w:t>
+      </w:r>
+      <w:proofErr w:type="spellStart"/>
+      <w:r>
+        <w:rPr>
+          <w:rFonts w:ascii="Verdana" w:eastAsia="굴림" w:hAnsi="Verdana" w:cs="굴림"/>
+          <w:b/>
+          <w:color w:val="333333"/>
+          <w:kern w:val="0"/>
+          <w:sz w:val="18"/>
+          <w:szCs w:val="18"/>
+        </w:rPr>
+        <w:t>apr</w:t>
+      </w:r>
+      <w:proofErr w:type="spellEnd"/>
+      <w:r>
+        <w:rPr>
+          <w:rFonts w:ascii="Verdana" w:eastAsia="굴림" w:hAnsi="Verdana" w:cs="굴림"/>
+          <w:b/>
+          <w:color w:val="333333"/>
+          <w:kern w:val="0"/>
+          <w:sz w:val="18"/>
+          <w:szCs w:val="18"/>
+        </w:rPr>
+        <w:t>-</w:t>
+      </w:r>
+      <w:proofErr w:type="spellStart"/>
+      <w:r>
+        <w:rPr>
+          <w:rFonts w:ascii="Verdana" w:eastAsia="굴림" w:hAnsi="Verdana" w:cs="굴림"/>
+          <w:b/>
+          <w:color w:val="333333"/>
+          <w:kern w:val="0"/>
+          <w:sz w:val="18"/>
+          <w:szCs w:val="18"/>
+        </w:rPr>
+        <w:t>util</w:t>
+      </w:r>
+      <w:proofErr w:type="spellEnd"/>
+      <w:r>
+        <w:rPr>
+          <w:rFonts w:ascii="Verdana" w:eastAsia="굴림" w:hAnsi="Verdana" w:cs="굴림"/>
+          <w:b/>
+          <w:color w:val="333333"/>
+          <w:kern w:val="0"/>
+          <w:sz w:val="18"/>
+          <w:szCs w:val="18"/>
+        </w:rPr>
+        <w:t xml:space="preserve"> \</w:t>
+      </w:r>
+      <w:r>
+        <w:rPr>
+          <w:rFonts w:ascii="Verdana" w:eastAsia="굴림" w:hAnsi="Verdana" w:cs="굴림"/>
+          <w:b/>
+          <w:color w:val="333333"/>
+          <w:kern w:val="0"/>
+          <w:sz w:val="18"/>
+          <w:szCs w:val="18"/>
+        </w:rPr>
+        <w:br/>
+      </w:r>
+      <w:r>
+        <w:rPr>
+          <w:rFonts w:ascii="Verdana" w:eastAsia="굴림" w:hAnsi="Verdana" w:cs="굴림"/>
+          <w:b/>
+          <w:color w:val="333333"/>
+          <w:kern w:val="0"/>
+          <w:sz w:val="18"/>
+          <w:szCs w:val="18"/>
+        </w:rPr>
+        <w:t>--with-</w:t>
+      </w:r>
+      <w:proofErr w:type="spellStart"/>
+      <w:r>
+        <w:rPr>
+          <w:rFonts w:ascii="Verdana" w:eastAsia="굴림" w:hAnsi="Verdana" w:cs="굴림"/>
+          <w:b/>
+          <w:color w:val="333333"/>
+          <w:kern w:val="0"/>
+          <w:sz w:val="18"/>
+          <w:szCs w:val="18"/>
+        </w:rPr>
+        <w:t>pcre</w:t>
+      </w:r>
+      <w:proofErr w:type="spellEnd"/>
+      <w:r>
+        <w:rPr>
+          <w:rFonts w:ascii="Verdana" w:eastAsia="굴림" w:hAnsi="Verdana" w:cs="굴림"/>
+          <w:b/>
+          <w:color w:val="333333"/>
+          <w:kern w:val="0"/>
+          <w:sz w:val="18"/>
+          <w:szCs w:val="18"/>
+        </w:rPr>
+        <w:t>=/</w:t>
+      </w:r>
+      <w:proofErr w:type="spellStart"/>
+      <w:r>
+        <w:rPr>
+          <w:rFonts w:ascii="Verdana" w:eastAsia="굴림" w:hAnsi="Verdana" w:cs="굴림"/>
+          <w:b/>
+          <w:color w:val="333333"/>
+          <w:kern w:val="0"/>
+          <w:sz w:val="18"/>
+          <w:szCs w:val="18"/>
+        </w:rPr>
+        <w:t>usr</w:t>
+      </w:r>
+      <w:proofErr w:type="spellEnd"/>
+      <w:r>
+        <w:rPr>
+          <w:rFonts w:ascii="Verdana" w:eastAsia="굴림" w:hAnsi="Verdana" w:cs="굴림"/>
+          <w:b/>
+          <w:color w:val="333333"/>
+          <w:kern w:val="0"/>
+          <w:sz w:val="18"/>
+          <w:szCs w:val="18"/>
+        </w:rPr>
+        <w:t>/local/</w:t>
+      </w:r>
+      <w:proofErr w:type="spellStart"/>
+      <w:r>
+        <w:rPr>
+          <w:rFonts w:ascii="Verdana" w:eastAsia="굴림" w:hAnsi="Verdana" w:cs="굴림"/>
+          <w:b/>
+          <w:color w:val="333333"/>
+          <w:kern w:val="0"/>
+          <w:sz w:val="18"/>
+          <w:szCs w:val="18"/>
+        </w:rPr>
+        <w:t>pcre</w:t>
+      </w:r>
+      <w:proofErr w:type="spellEnd"/>
+      <w:r>
+        <w:rPr>
+          <w:rFonts w:ascii="Verdana" w:eastAsia="굴림" w:hAnsi="Verdana" w:cs="굴림"/>
+          <w:b/>
+          <w:color w:val="333333"/>
+          <w:kern w:val="0"/>
+          <w:sz w:val="18"/>
+          <w:szCs w:val="18"/>
+        </w:rPr>
+        <w:t>/</w:t>
+      </w:r>
+    </w:p>
+    <w:p>
+      <w:pPr>
+        <w:pStyle w:val="a6"/>
+        <w:widowControl/>
+        <w:numPr>
+          <w:ilvl w:val="0"/>
+          <w:numId w:val="24"/>
+        </w:numPr>
+        <w:shd w:val="clear" w:color="auto" w:fill="FFFFFF"/>
+        <w:wordWrap/>
+        <w:autoSpaceDE/>
+        <w:autoSpaceDN/>
+        <w:spacing w:before="100" w:beforeAutospacing="1" w:after="100" w:afterAutospacing="1" w:line="240" w:lineRule="auto"/>
+        <w:ind w:leftChars="0"/>
+        <w:jc w:val="left"/>
+        <w:rPr>
+          <w:rFonts w:ascii="Verdana" w:eastAsia="굴림" w:hAnsi="Verdana" w:cs="굴림"/>
+          <w:b/>
+          <w:color w:val="333333"/>
+          <w:kern w:val="0"/>
+          <w:sz w:val="18"/>
+          <w:szCs w:val="18"/>
+        </w:rPr>
+      </w:pPr>
+      <w:r>
+        <w:rPr>
+          <w:rFonts w:ascii="Verdana" w:eastAsia="굴림" w:hAnsi="Verdana" w:cs="굴림"/>
+          <w:b/>
           <w:color w:val="333333"/>
           <w:kern w:val="0"/>
           <w:sz w:val="18"/>
@@ -10623,13 +9573,13 @@
           <w:numId w:val="35"/>
         </w:numPr>
       </w:pPr>
-      <w:bookmarkStart w:id="52" w:name="_Toc488328263"/>
-      <w:bookmarkStart w:id="53" w:name="_Toc28005356"/>
+      <w:bookmarkStart w:id="51" w:name="_Toc488328263"/>
+      <w:bookmarkStart w:id="52" w:name="_Toc28005356"/>
       <w:r>
         <w:t>alias 추가</w:t>
       </w:r>
+      <w:bookmarkEnd w:id="51"/>
       <w:bookmarkEnd w:id="52"/>
-      <w:bookmarkEnd w:id="53"/>
     </w:p>
     <w:p>
       <w:pPr>
@@ -11033,7 +9983,7 @@
           <w:numId w:val="35"/>
         </w:numPr>
       </w:pPr>
-      <w:bookmarkStart w:id="54" w:name="_Toc28005357"/>
+      <w:bookmarkStart w:id="53" w:name="_Toc28005357"/>
       <w:r>
         <w:rPr>
           <w:rFonts w:hint="eastAsia"/>
@@ -11049,7 +9999,7 @@
         </w:rPr>
         <w:t>종료</w:t>
       </w:r>
-      <w:bookmarkEnd w:id="54"/>
+      <w:bookmarkEnd w:id="53"/>
     </w:p>
     <w:p>
       <w:pPr>
@@ -11161,19 +10111,7 @@
           <w:sz w:val="18"/>
           <w:szCs w:val="18"/>
         </w:rPr>
-        <w:t>start</w:t>
-      </w:r>
-      <w:r>
-        <w:rPr>
-          <w:rFonts w:ascii="Verdana" w:eastAsia="굴림" w:hAnsi="Verdana" w:cs="굴림"/>
-          <w:b/>
-          <w:bCs/>
-          <w:color w:val="333333"/>
-          <w:kern w:val="0"/>
-          <w:sz w:val="18"/>
-          <w:szCs w:val="18"/>
-        </w:rPr>
-        <w:t xml:space="preserve"> :</w:t>
+        <w:t>start :</w:t>
       </w:r>
       <w:proofErr w:type="gramEnd"/>
       <w:r>
@@ -11323,7 +10261,7 @@
         <w:spacing w:before="100" w:beforeAutospacing="1" w:after="100" w:afterAutospacing="1" w:line="240" w:lineRule="auto"/>
         <w:jc w:val="left"/>
         <w:rPr>
-          <w:rFonts w:ascii="Verdana" w:eastAsia="굴림" w:hAnsi="Verdana" w:cs="굴림" w:hint="eastAsia"/>
+          <w:rFonts w:ascii="Verdana" w:eastAsia="굴림" w:hAnsi="Verdana" w:cs="굴림"/>
           <w:color w:val="333333"/>
           <w:kern w:val="0"/>
           <w:sz w:val="18"/>
@@ -11339,7 +10277,7 @@
           <w:numId w:val="35"/>
         </w:numPr>
       </w:pPr>
-      <w:bookmarkStart w:id="55" w:name="_Toc28005358"/>
+      <w:bookmarkStart w:id="54" w:name="_Toc28005358"/>
       <w:r>
         <w:rPr>
           <w:rFonts w:hint="eastAsia"/>
@@ -11347,7 +10285,7 @@
         <w:lastRenderedPageBreak/>
         <w:t>작동 여부 확인</w:t>
       </w:r>
-      <w:bookmarkEnd w:id="55"/>
+      <w:bookmarkEnd w:id="54"/>
     </w:p>
     <w:p>
       <w:pPr>
@@ -11372,6 +10310,7 @@
           <w:szCs w:val="18"/>
         </w:rPr>
       </w:pPr>
+      <w:proofErr w:type="spellStart"/>
       <w:r>
         <w:rPr>
           <w:rFonts w:ascii="Verdana" w:eastAsia="굴림" w:hAnsi="Verdana" w:cs="굴림"/>
@@ -11382,11 +10321,12 @@
           <w:sz w:val="18"/>
           <w:szCs w:val="18"/>
         </w:rPr>
-        <w:t>source /</w:t>
-      </w:r>
-      <w:r>
-        <w:rPr>
-          <w:rFonts w:ascii="Verdana" w:eastAsia="굴림" w:hAnsi="Verdana" w:cs="굴림" w:hint="eastAsia"/>
+        <w:t>ps</w:t>
+      </w:r>
+      <w:proofErr w:type="spellEnd"/>
+      <w:r>
+        <w:rPr>
+          <w:rFonts w:ascii="Verdana" w:eastAsia="굴림" w:hAnsi="Verdana" w:cs="굴림"/>
           <w:b/>
           <w:bCs/>
           <w:color w:val="333333"/>
@@ -11394,12 +10334,12 @@
           <w:sz w:val="18"/>
           <w:szCs w:val="18"/>
         </w:rPr>
-        <w:t>root</w:t>
-      </w:r>
-      <w:proofErr w:type="gramStart"/>
-      <w:r>
-        <w:rPr>
-          <w:rFonts w:ascii="Verdana" w:eastAsia="굴림" w:hAnsi="Verdana" w:cs="굴림" w:hint="eastAsia"/>
+        <w:t xml:space="preserve"> </w:t>
+      </w:r>
+      <w:proofErr w:type="spellStart"/>
+      <w:r>
+        <w:rPr>
+          <w:rFonts w:ascii="Verdana" w:eastAsia="굴림" w:hAnsi="Verdana" w:cs="굴림"/>
           <w:b/>
           <w:bCs/>
           <w:color w:val="333333"/>
@@ -11407,12 +10347,25 @@
           <w:sz w:val="18"/>
           <w:szCs w:val="18"/>
         </w:rPr>
-        <w:t>/.</w:t>
+        <w:t>aux|grep</w:t>
+      </w:r>
+      <w:proofErr w:type="spellEnd"/>
+      <w:r>
+        <w:rPr>
+          <w:rFonts w:ascii="Verdana" w:eastAsia="굴림" w:hAnsi="Verdana" w:cs="굴림"/>
+          <w:b/>
+          <w:bCs/>
+          <w:color w:val="333333"/>
+          <w:kern w:val="0"/>
+          <w:sz w:val="18"/>
+          <w:szCs w:val="18"/>
+        </w:rPr>
+        <w:t xml:space="preserve"> </w:t>
       </w:r>
       <w:proofErr w:type="spellStart"/>
       <w:r>
         <w:rPr>
-          <w:rFonts w:ascii="Verdana" w:eastAsia="굴림" w:hAnsi="Verdana" w:cs="굴림" w:hint="eastAsia"/>
+          <w:rFonts w:ascii="Verdana" w:eastAsia="굴림" w:hAnsi="Verdana" w:cs="굴림"/>
           <w:b/>
           <w:bCs/>
           <w:color w:val="333333"/>
@@ -11420,234 +10373,9 @@
           <w:sz w:val="18"/>
           <w:szCs w:val="18"/>
         </w:rPr>
-        <w:t>bashrc</w:t>
+        <w:t>httpd</w:t>
       </w:r>
       <w:proofErr w:type="spellEnd"/>
-      <w:proofErr w:type="gramEnd"/>
-    </w:p>
-    <w:p>
-      <w:pPr>
-        <w:pStyle w:val="a6"/>
-        <w:widowControl/>
-        <w:numPr>
-          <w:ilvl w:val="0"/>
-          <w:numId w:val="27"/>
-        </w:numPr>
-        <w:shd w:val="clear" w:color="auto" w:fill="FFFFFF"/>
-        <w:wordWrap/>
-        <w:autoSpaceDE/>
-        <w:autoSpaceDN/>
-        <w:spacing w:before="100" w:beforeAutospacing="1" w:after="100" w:afterAutospacing="1" w:line="240" w:lineRule="auto"/>
-        <w:ind w:leftChars="0"/>
-        <w:jc w:val="left"/>
-        <w:rPr>
-          <w:rFonts w:ascii="Verdana" w:eastAsia="굴림" w:hAnsi="Verdana" w:cs="굴림" w:hint="eastAsia"/>
-          <w:color w:val="333333"/>
-          <w:kern w:val="0"/>
-          <w:sz w:val="18"/>
-          <w:szCs w:val="18"/>
-        </w:rPr>
-      </w:pPr>
-      <w:proofErr w:type="spellStart"/>
-      <w:r>
-        <w:rPr>
-          <w:rFonts w:ascii="Verdana" w:eastAsia="굴림" w:hAnsi="Verdana" w:cs="굴림"/>
-          <w:b/>
-          <w:bCs/>
-          <w:color w:val="333333"/>
-          <w:kern w:val="0"/>
-          <w:sz w:val="18"/>
-          <w:szCs w:val="18"/>
-        </w:rPr>
-        <w:t>ps</w:t>
-      </w:r>
-      <w:proofErr w:type="spellEnd"/>
-      <w:r>
-        <w:rPr>
-          <w:rFonts w:ascii="Verdana" w:eastAsia="굴림" w:hAnsi="Verdana" w:cs="굴림"/>
-          <w:b/>
-          <w:bCs/>
-          <w:color w:val="333333"/>
-          <w:kern w:val="0"/>
-          <w:sz w:val="18"/>
-          <w:szCs w:val="18"/>
-        </w:rPr>
-        <w:t xml:space="preserve"> </w:t>
-      </w:r>
-      <w:proofErr w:type="spellStart"/>
-      <w:r>
-        <w:rPr>
-          <w:rFonts w:ascii="Verdana" w:eastAsia="굴림" w:hAnsi="Verdana" w:cs="굴림"/>
-          <w:b/>
-          <w:bCs/>
-          <w:color w:val="333333"/>
-          <w:kern w:val="0"/>
-          <w:sz w:val="18"/>
-          <w:szCs w:val="18"/>
-        </w:rPr>
-        <w:t>aux|grep</w:t>
-      </w:r>
-      <w:proofErr w:type="spellEnd"/>
-      <w:r>
-        <w:rPr>
-          <w:rFonts w:ascii="Verdana" w:eastAsia="굴림" w:hAnsi="Verdana" w:cs="굴림"/>
-          <w:b/>
-          <w:bCs/>
-          <w:color w:val="333333"/>
-          <w:kern w:val="0"/>
-          <w:sz w:val="18"/>
-          <w:szCs w:val="18"/>
-        </w:rPr>
-        <w:t xml:space="preserve"> </w:t>
-      </w:r>
-      <w:proofErr w:type="spellStart"/>
-      <w:r>
-        <w:rPr>
-          <w:rFonts w:ascii="Verdana" w:eastAsia="굴림" w:hAnsi="Verdana" w:cs="굴림"/>
-          <w:b/>
-          <w:bCs/>
-          <w:color w:val="333333"/>
-          <w:kern w:val="0"/>
-          <w:sz w:val="18"/>
-          <w:szCs w:val="18"/>
-        </w:rPr>
-        <w:t>httpd</w:t>
-      </w:r>
-      <w:proofErr w:type="spellEnd"/>
-      <w:r>
-        <w:rPr>
-          <w:rFonts w:ascii="Verdana" w:eastAsia="굴림" w:hAnsi="Verdana" w:cs="굴림"/>
-          <w:bCs/>
-          <w:color w:val="333333"/>
-          <w:kern w:val="0"/>
-          <w:sz w:val="18"/>
-          <w:szCs w:val="18"/>
-        </w:rPr>
-        <w:t xml:space="preserve"> </w:t>
-      </w:r>
-      <w:r>
-        <w:rPr>
-          <w:rFonts w:ascii="Verdana" w:eastAsia="굴림" w:hAnsi="Verdana" w:cs="굴림" w:hint="eastAsia"/>
-          <w:bCs/>
-          <w:color w:val="333333"/>
-          <w:kern w:val="0"/>
-          <w:sz w:val="18"/>
-          <w:szCs w:val="18"/>
-        </w:rPr>
-        <w:t>명령어로</w:t>
-      </w:r>
-      <w:r>
-        <w:rPr>
-          <w:rFonts w:ascii="Verdana" w:eastAsia="굴림" w:hAnsi="Verdana" w:cs="굴림" w:hint="eastAsia"/>
-          <w:bCs/>
-          <w:color w:val="333333"/>
-          <w:kern w:val="0"/>
-          <w:sz w:val="18"/>
-          <w:szCs w:val="18"/>
-        </w:rPr>
-        <w:t xml:space="preserve"> </w:t>
-      </w:r>
-      <w:proofErr w:type="spellStart"/>
-      <w:r>
-        <w:rPr>
-          <w:rFonts w:ascii="Verdana" w:eastAsia="굴림" w:hAnsi="Verdana" w:cs="굴림"/>
-          <w:bCs/>
-          <w:color w:val="333333"/>
-          <w:kern w:val="0"/>
-          <w:sz w:val="18"/>
-          <w:szCs w:val="18"/>
-        </w:rPr>
-        <w:t>httpd</w:t>
-      </w:r>
-      <w:proofErr w:type="spellEnd"/>
-      <w:r>
-        <w:rPr>
-          <w:rFonts w:ascii="Verdana" w:eastAsia="굴림" w:hAnsi="Verdana" w:cs="굴림"/>
-          <w:bCs/>
-          <w:color w:val="333333"/>
-          <w:kern w:val="0"/>
-          <w:sz w:val="18"/>
-          <w:szCs w:val="18"/>
-        </w:rPr>
-        <w:t xml:space="preserve"> </w:t>
-      </w:r>
-      <w:r>
-        <w:rPr>
-          <w:rFonts w:ascii="Verdana" w:eastAsia="굴림" w:hAnsi="Verdana" w:cs="굴림" w:hint="eastAsia"/>
-          <w:bCs/>
-          <w:color w:val="333333"/>
-          <w:kern w:val="0"/>
-          <w:sz w:val="18"/>
-          <w:szCs w:val="18"/>
-        </w:rPr>
-        <w:t>가</w:t>
-      </w:r>
-      <w:r>
-        <w:rPr>
-          <w:rFonts w:ascii="Verdana" w:eastAsia="굴림" w:hAnsi="Verdana" w:cs="굴림" w:hint="eastAsia"/>
-          <w:bCs/>
-          <w:color w:val="333333"/>
-          <w:kern w:val="0"/>
-          <w:sz w:val="18"/>
-          <w:szCs w:val="18"/>
-        </w:rPr>
-        <w:t xml:space="preserve"> </w:t>
-      </w:r>
-      <w:r>
-        <w:rPr>
-          <w:rFonts w:ascii="Verdana" w:eastAsia="굴림" w:hAnsi="Verdana" w:cs="굴림" w:hint="eastAsia"/>
-          <w:bCs/>
-          <w:color w:val="333333"/>
-          <w:kern w:val="0"/>
-          <w:sz w:val="18"/>
-          <w:szCs w:val="18"/>
-        </w:rPr>
-        <w:t>올라가</w:t>
-      </w:r>
-      <w:r>
-        <w:rPr>
-          <w:rFonts w:ascii="Verdana" w:eastAsia="굴림" w:hAnsi="Verdana" w:cs="굴림" w:hint="eastAsia"/>
-          <w:bCs/>
-          <w:color w:val="333333"/>
-          <w:kern w:val="0"/>
-          <w:sz w:val="18"/>
-          <w:szCs w:val="18"/>
-        </w:rPr>
-        <w:t xml:space="preserve"> </w:t>
-      </w:r>
-      <w:r>
-        <w:rPr>
-          <w:rFonts w:ascii="Verdana" w:eastAsia="굴림" w:hAnsi="Verdana" w:cs="굴림" w:hint="eastAsia"/>
-          <w:bCs/>
-          <w:color w:val="333333"/>
-          <w:kern w:val="0"/>
-          <w:sz w:val="18"/>
-          <w:szCs w:val="18"/>
-        </w:rPr>
-        <w:t>있는지</w:t>
-      </w:r>
-      <w:r>
-        <w:rPr>
-          <w:rFonts w:ascii="Verdana" w:eastAsia="굴림" w:hAnsi="Verdana" w:cs="굴림" w:hint="eastAsia"/>
-          <w:bCs/>
-          <w:color w:val="333333"/>
-          <w:kern w:val="0"/>
-          <w:sz w:val="18"/>
-          <w:szCs w:val="18"/>
-        </w:rPr>
-        <w:t xml:space="preserve"> </w:t>
-      </w:r>
-      <w:r>
-        <w:rPr>
-          <w:rFonts w:ascii="Verdana" w:eastAsia="굴림" w:hAnsi="Verdana" w:cs="굴림" w:hint="eastAsia"/>
-          <w:bCs/>
-          <w:color w:val="333333"/>
-          <w:kern w:val="0"/>
-          <w:sz w:val="18"/>
-          <w:szCs w:val="18"/>
-        </w:rPr>
-        <w:t>확인</w:t>
-      </w:r>
       <w:r>
         <w:rPr>
           <w:rFonts w:ascii="Verdana" w:eastAsia="굴림" w:hAnsi="Verdana" w:cs="굴림"/>
@@ -11917,14 +10645,14 @@
           <w:numId w:val="35"/>
         </w:numPr>
       </w:pPr>
-      <w:bookmarkStart w:id="56" w:name="_Toc28005359"/>
+      <w:bookmarkStart w:id="55" w:name="_Toc28005359"/>
       <w:r>
         <w:rPr>
           <w:rFonts w:hint="eastAsia"/>
         </w:rPr>
         <w:t>부팅 시 자동 실행하기</w:t>
       </w:r>
-      <w:bookmarkEnd w:id="56"/>
+      <w:bookmarkEnd w:id="55"/>
     </w:p>
     <w:p>
       <w:pPr>
@@ -12085,6 +10813,18 @@
         </w:rPr>
         <w:br/>
       </w:r>
+      <w:r>
+        <w:rPr>
+          <w:rFonts w:ascii="Verdana" w:eastAsia="굴림" w:hAnsi="Verdana" w:cs="굴림"/>
+          <w:b/>
+          <w:bCs/>
+          <w:color w:val="333333"/>
+          <w:kern w:val="0"/>
+          <w:sz w:val="18"/>
+          <w:szCs w:val="18"/>
+        </w:rPr>
+        <w:t>/</w:t>
+      </w:r>
       <w:proofErr w:type="spellStart"/>
       <w:r>
         <w:rPr>
@@ -12096,6 +10836,32 @@
           <w:sz w:val="18"/>
           <w:szCs w:val="18"/>
         </w:rPr>
+        <w:t>usr</w:t>
+      </w:r>
+      <w:proofErr w:type="spellEnd"/>
+      <w:r>
+        <w:rPr>
+          <w:rFonts w:ascii="Verdana" w:eastAsia="굴림" w:hAnsi="Verdana" w:cs="굴림"/>
+          <w:b/>
+          <w:bCs/>
+          <w:color w:val="333333"/>
+          <w:kern w:val="0"/>
+          <w:sz w:val="18"/>
+          <w:szCs w:val="18"/>
+        </w:rPr>
+        <w:t>/local/</w:t>
+      </w:r>
+      <w:proofErr w:type="spellStart"/>
+      <w:r>
+        <w:rPr>
+          <w:rFonts w:ascii="Verdana" w:eastAsia="굴림" w:hAnsi="Verdana" w:cs="굴림"/>
+          <w:b/>
+          <w:bCs/>
+          <w:color w:val="333333"/>
+          <w:kern w:val="0"/>
+          <w:sz w:val="18"/>
+          <w:szCs w:val="18"/>
+        </w:rPr>
         <w:t>httpd</w:t>
       </w:r>
       <w:proofErr w:type="spellEnd"/>
@@ -12109,7 +10875,7 @@
           <w:sz w:val="18"/>
           <w:szCs w:val="18"/>
         </w:rPr>
-        <w:t xml:space="preserve"> -d /</w:t>
+        <w:t>/bin/</w:t>
       </w:r>
       <w:proofErr w:type="spellStart"/>
       <w:r>
@@ -12122,6 +10888,32 @@
           <w:sz w:val="18"/>
           <w:szCs w:val="18"/>
         </w:rPr>
+        <w:t>apachectl</w:t>
+      </w:r>
+      <w:proofErr w:type="spellEnd"/>
+      <w:r>
+        <w:rPr>
+          <w:rFonts w:ascii="Verdana" w:eastAsia="굴림" w:hAnsi="Verdana" w:cs="굴림"/>
+          <w:b/>
+          <w:bCs/>
+          <w:color w:val="333333"/>
+          <w:kern w:val="0"/>
+          <w:sz w:val="18"/>
+          <w:szCs w:val="18"/>
+        </w:rPr>
+        <w:t xml:space="preserve"> -f /</w:t>
+      </w:r>
+      <w:proofErr w:type="spellStart"/>
+      <w:r>
+        <w:rPr>
+          <w:rFonts w:ascii="Verdana" w:eastAsia="굴림" w:hAnsi="Verdana" w:cs="굴림"/>
+          <w:b/>
+          <w:bCs/>
+          <w:color w:val="333333"/>
+          <w:kern w:val="0"/>
+          <w:sz w:val="18"/>
+          <w:szCs w:val="18"/>
+        </w:rPr>
         <w:t>usr</w:t>
       </w:r>
       <w:proofErr w:type="spellEnd"/>
@@ -12149,6 +10941,58 @@
           <w:szCs w:val="18"/>
         </w:rPr>
         <w:t>httpd</w:t>
+      </w:r>
+      <w:proofErr w:type="spellEnd"/>
+      <w:r>
+        <w:rPr>
+          <w:rFonts w:ascii="Verdana" w:eastAsia="굴림" w:hAnsi="Verdana" w:cs="굴림"/>
+          <w:b/>
+          <w:bCs/>
+          <w:color w:val="333333"/>
+          <w:kern w:val="0"/>
+          <w:sz w:val="18"/>
+          <w:szCs w:val="18"/>
+        </w:rPr>
+        <w:t>/</w:t>
+      </w:r>
+      <w:proofErr w:type="spellStart"/>
+      <w:r>
+        <w:rPr>
+          <w:rFonts w:ascii="Verdana" w:eastAsia="굴림" w:hAnsi="Verdana" w:cs="굴림"/>
+          <w:b/>
+          <w:bCs/>
+          <w:color w:val="333333"/>
+          <w:kern w:val="0"/>
+          <w:sz w:val="18"/>
+          <w:szCs w:val="18"/>
+        </w:rPr>
+        <w:t>conf</w:t>
+      </w:r>
+      <w:proofErr w:type="spellEnd"/>
+      <w:r>
+        <w:rPr>
+          <w:rFonts w:ascii="Verdana" w:eastAsia="굴림" w:hAnsi="Verdana" w:cs="굴림"/>
+          <w:b/>
+          <w:bCs/>
+          <w:color w:val="333333"/>
+          <w:kern w:val="0"/>
+          <w:sz w:val="18"/>
+          <w:szCs w:val="18"/>
+        </w:rPr>
+        <w:t>/</w:t>
+      </w:r>
+      <w:proofErr w:type="spellStart"/>
+      <w:r>
+        <w:rPr>
+          <w:rFonts w:ascii="Verdana" w:eastAsia="굴림" w:hAnsi="Verdana" w:cs="굴림"/>
+          <w:b/>
+          <w:bCs/>
+          <w:color w:val="333333"/>
+          <w:kern w:val="0"/>
+          <w:sz w:val="18"/>
+          <w:szCs w:val="18"/>
+        </w:rPr>
+        <w:t>httpd.conf</w:t>
       </w:r>
       <w:proofErr w:type="spellEnd"/>
     </w:p>
@@ -12199,14 +11043,11 @@
       <w:pPr>
         <w:pStyle w:val="ae"/>
         <w:ind w:right="200"/>
-        <w:rPr>
-          <w:rFonts w:hint="eastAsia"/>
-        </w:rPr>
       </w:pPr>
     </w:p>
-    <w:bookmarkStart w:id="57" w:name="_Toc488328268"/>
-    <w:bookmarkStart w:id="58" w:name="_Toc488328303"/>
-    <w:bookmarkStart w:id="59" w:name="_Toc496545314"/>
+    <w:bookmarkStart w:id="56" w:name="_Toc488328268"/>
+    <w:bookmarkStart w:id="57" w:name="_Toc488328303"/>
+    <w:bookmarkStart w:id="58" w:name="_Toc496545314"/>
     <w:p>
       <w:pPr>
         <w:pStyle w:val="ae"/>
@@ -12315,9 +11156,9 @@
           </mc:Fallback>
         </mc:AlternateContent>
       </w:r>
+      <w:bookmarkEnd w:id="56"/>
       <w:bookmarkEnd w:id="57"/>
       <w:bookmarkEnd w:id="58"/>
-      <w:bookmarkEnd w:id="59"/>
     </w:p>
     <w:p>
       <w:pPr>
@@ -12328,7 +11169,7 @@
         </w:numPr>
         <w:ind w:left="200" w:right="200"/>
       </w:pPr>
-      <w:bookmarkStart w:id="60" w:name="_Toc28005360"/>
+      <w:bookmarkStart w:id="59" w:name="_Toc28005360"/>
       <w:proofErr w:type="spellStart"/>
       <w:r>
         <w:rPr>
@@ -12350,7 +11191,7 @@
         </w:rPr>
         <w:t>로드밸런싱</w:t>
       </w:r>
-      <w:bookmarkEnd w:id="60"/>
+      <w:bookmarkEnd w:id="59"/>
       <w:proofErr w:type="spellEnd"/>
     </w:p>
     <w:p>
@@ -12485,9 +11326,6 @@
     <w:p>
       <w:pPr>
         <w:pStyle w:val="ad"/>
-        <w:rPr>
-          <w:rFonts w:hint="eastAsia"/>
-        </w:rPr>
       </w:pPr>
       <w:r>
         <w:rPr>
@@ -12511,7 +11349,7 @@
                     </pic:cNvPicPr>
                   </pic:nvPicPr>
                   <pic:blipFill>
-                    <a:blip r:embed="rId15">
+                    <a:blip r:embed="rId28">
                       <a:extLst>
                         <a:ext uri="{28A0092B-C50C-407E-A947-70E740481C1C}">
                           <a14:useLocalDpi xmlns:a14="http://schemas.microsoft.com/office/drawing/2010/main" val="0"/>
@@ -12595,7 +11433,7 @@
                     </pic:cNvPicPr>
                   </pic:nvPicPr>
                   <pic:blipFill>
-                    <a:blip r:embed="rId15">
+                    <a:blip r:embed="rId28">
                       <a:extLst>
                         <a:ext uri="{28A0092B-C50C-407E-A947-70E740481C1C}">
                           <a14:useLocalDpi xmlns:a14="http://schemas.microsoft.com/office/drawing/2010/main" val="0"/>
@@ -12662,7 +11500,7 @@
                     </pic:cNvPicPr>
                   </pic:nvPicPr>
                   <pic:blipFill>
-                    <a:blip r:embed="rId15">
+                    <a:blip r:embed="rId28">
                       <a:extLst>
                         <a:ext uri="{28A0092B-C50C-407E-A947-70E740481C1C}">
                           <a14:useLocalDpi xmlns:a14="http://schemas.microsoft.com/office/drawing/2010/main" val="0"/>
@@ -12750,7 +11588,7 @@
                     </pic:cNvPicPr>
                   </pic:nvPicPr>
                   <pic:blipFill>
-                    <a:blip r:embed="rId15">
+                    <a:blip r:embed="rId28">
                       <a:extLst>
                         <a:ext uri="{28A0092B-C50C-407E-A947-70E740481C1C}">
                           <a14:useLocalDpi xmlns:a14="http://schemas.microsoft.com/office/drawing/2010/main" val="0"/>
@@ -12848,7 +11686,7 @@
                     </pic:cNvPicPr>
                   </pic:nvPicPr>
                   <pic:blipFill>
-                    <a:blip r:embed="rId15">
+                    <a:blip r:embed="rId28">
                       <a:extLst>
                         <a:ext uri="{28A0092B-C50C-407E-A947-70E740481C1C}">
                           <a14:useLocalDpi xmlns:a14="http://schemas.microsoft.com/office/drawing/2010/main" val="0"/>
@@ -12932,7 +11770,7 @@
                     </pic:cNvPicPr>
                   </pic:nvPicPr>
                   <pic:blipFill>
-                    <a:blip r:embed="rId15">
+                    <a:blip r:embed="rId28">
                       <a:extLst>
                         <a:ext uri="{28A0092B-C50C-407E-A947-70E740481C1C}">
                           <a14:useLocalDpi xmlns:a14="http://schemas.microsoft.com/office/drawing/2010/main" val="0"/>
@@ -13057,7 +11895,7 @@
       <w:r>
         <w:br w:type="page"/>
       </w:r>
-      <w:bookmarkStart w:id="61" w:name="_Toc28005361"/>
+      <w:bookmarkStart w:id="60" w:name="_Toc28005361"/>
       <w:r>
         <w:lastRenderedPageBreak/>
         <w:t xml:space="preserve">HTTPD </w:t>
@@ -13070,7 +11908,7 @@
       <w:r>
         <w:t xml:space="preserve"> 설정</w:t>
       </w:r>
-      <w:bookmarkEnd w:id="61"/>
+      <w:bookmarkEnd w:id="60"/>
     </w:p>
     <w:p>
       <w:pPr>
@@ -13657,7 +12495,7 @@
                     <pic:cNvPicPr/>
                   </pic:nvPicPr>
                   <pic:blipFill rotWithShape="1">
-                    <a:blip r:embed="rId28"/>
+                    <a:blip r:embed="rId29"/>
                     <a:srcRect l="161" r="-1"/>
                     <a:stretch/>
                   </pic:blipFill>
@@ -13716,7 +12554,7 @@
                     <pic:cNvPicPr/>
                   </pic:nvPicPr>
                   <pic:blipFill>
-                    <a:blip r:embed="rId29"/>
+                    <a:blip r:embed="rId30"/>
                     <a:stretch>
                       <a:fillRect/>
                     </a:stretch>
@@ -13766,7 +12604,7 @@
                     <pic:cNvPicPr/>
                   </pic:nvPicPr>
                   <pic:blipFill>
-                    <a:blip r:embed="rId30"/>
+                    <a:blip r:embed="rId31"/>
                     <a:stretch>
                       <a:fillRect/>
                     </a:stretch>
@@ -13794,7 +12632,7 @@
         <w:autoSpaceDE/>
         <w:autoSpaceDN/>
         <w:rPr>
-          <w:rFonts w:ascii="Verdana" w:eastAsia="굴림" w:hAnsi="Verdana" w:cs="굴림" w:hint="eastAsia"/>
+          <w:rFonts w:ascii="Verdana" w:eastAsia="굴림" w:hAnsi="Verdana" w:cs="굴림"/>
           <w:color w:val="333333"/>
           <w:kern w:val="0"/>
           <w:sz w:val="18"/>
@@ -14046,6 +12884,26 @@
         <w:t>workerNameLog</w:t>
       </w:r>
       <w:proofErr w:type="spellEnd"/>
+    </w:p>
+    <w:p>
+      <w:pPr>
+        <w:pStyle w:val="a6"/>
+        <w:widowControl/>
+        <w:shd w:val="clear" w:color="auto" w:fill="FFFFFF"/>
+        <w:wordWrap/>
+        <w:autoSpaceDE/>
+        <w:autoSpaceDN/>
+        <w:spacing w:before="100" w:beforeAutospacing="1" w:after="100" w:afterAutospacing="1" w:line="240" w:lineRule="auto"/>
+        <w:ind w:leftChars="0"/>
+        <w:jc w:val="left"/>
+        <w:rPr>
+          <w:rFonts w:ascii="Verdana" w:eastAsia="굴림" w:hAnsi="Verdana" w:cs="굴림"/>
+          <w:color w:val="333333"/>
+          <w:kern w:val="0"/>
+          <w:sz w:val="18"/>
+          <w:szCs w:val="18"/>
+        </w:rPr>
+      </w:pPr>
       <w:r>
         <w:rPr>
           <w:rFonts w:ascii="Verdana" w:eastAsia="굴림" w:hAnsi="Verdana" w:cs="굴림"/>
@@ -14076,7 +12934,7 @@
                     <pic:cNvPicPr/>
                   </pic:nvPicPr>
                   <pic:blipFill>
-                    <a:blip r:embed="rId31"/>
+                    <a:blip r:embed="rId32"/>
                     <a:stretch>
                       <a:fillRect/>
                     </a:stretch>
@@ -15722,7 +14580,7 @@
               <w:ind w:left="403"/>
               <w:jc w:val="left"/>
               <w:rPr>
-                <w:rFonts w:ascii="Verdana" w:eastAsia="굴림" w:hAnsi="Verdana" w:cs="굴림" w:hint="eastAsia"/>
+                <w:rFonts w:ascii="Verdana" w:eastAsia="굴림" w:hAnsi="Verdana" w:cs="굴림"/>
                 <w:color w:val="333333"/>
                 <w:kern w:val="0"/>
                 <w:sz w:val="18"/>
@@ -15772,7 +14630,7 @@
                           <pic:cNvPicPr/>
                         </pic:nvPicPr>
                         <pic:blipFill>
-                          <a:blip r:embed="rId32"/>
+                          <a:blip r:embed="rId33"/>
                           <a:stretch>
                             <a:fillRect/>
                           </a:stretch>
@@ -15804,12 +14662,12 @@
           <w:numId w:val="14"/>
         </w:numPr>
       </w:pPr>
-      <w:bookmarkStart w:id="62" w:name="_Toc28005362"/>
+      <w:bookmarkStart w:id="61" w:name="_Toc28005362"/>
       <w:r>
         <w:lastRenderedPageBreak/>
         <w:t>Tomcat server.xml 설정</w:t>
       </w:r>
-      <w:bookmarkEnd w:id="62"/>
+      <w:bookmarkEnd w:id="61"/>
     </w:p>
     <w:p>
       <w:pPr>
@@ -15826,13 +14684,6 @@
         <w:spacing w:before="100" w:beforeAutospacing="1" w:after="100" w:afterAutospacing="1" w:line="240" w:lineRule="auto"/>
         <w:ind w:leftChars="0"/>
         <w:jc w:val="left"/>
-        <w:rPr>
-          <w:rFonts w:ascii="Verdana" w:eastAsia="굴림" w:hAnsi="Verdana" w:cs="굴림"/>
-          <w:color w:val="333333"/>
-          <w:kern w:val="0"/>
-          <w:sz w:val="18"/>
-          <w:szCs w:val="18"/>
-        </w:rPr>
       </w:pPr>
       <w:proofErr w:type="spellStart"/>
       <w:r>
@@ -16256,7 +15107,7 @@
                     </pic:cNvPicPr>
                   </pic:nvPicPr>
                   <pic:blipFill>
-                    <a:blip r:embed="rId33">
+                    <a:blip r:embed="rId34">
                       <a:extLst>
                         <a:ext uri="{28A0092B-C50C-407E-A947-70E740481C1C}">
                           <a14:useLocalDpi xmlns:a14="http://schemas.microsoft.com/office/drawing/2010/main" val="0"/>
@@ -16412,7 +15263,7 @@
                     </pic:cNvPicPr>
                   </pic:nvPicPr>
                   <pic:blipFill rotWithShape="1">
-                    <a:blip r:embed="rId34">
+                    <a:blip r:embed="rId35">
                       <a:extLst>
                         <a:ext uri="{28A0092B-C50C-407E-A947-70E740481C1C}">
                           <a14:useLocalDpi xmlns:a14="http://schemas.microsoft.com/office/drawing/2010/main" val="0"/>
@@ -16467,429 +15318,18 @@
         <w:br/>
         <w:t> </w:t>
       </w:r>
-    </w:p>
-    <w:p>
-      <w:pPr>
-        <w:pStyle w:val="a6"/>
-        <w:widowControl/>
-        <w:numPr>
-          <w:ilvl w:val="0"/>
-          <w:numId w:val="15"/>
-        </w:numPr>
-        <w:shd w:val="clear" w:color="auto" w:fill="FFFFFF"/>
-        <w:wordWrap/>
-        <w:autoSpaceDE/>
-        <w:autoSpaceDN/>
-        <w:spacing w:before="100" w:beforeAutospacing="1" w:after="100" w:afterAutospacing="1" w:line="240" w:lineRule="auto"/>
-        <w:ind w:leftChars="0"/>
-        <w:jc w:val="left"/>
-        <w:rPr>
-          <w:rFonts w:ascii="Verdana" w:eastAsia="굴림" w:hAnsi="Verdana" w:cs="굴림"/>
-          <w:color w:val="333333"/>
-          <w:kern w:val="0"/>
-          <w:sz w:val="18"/>
-          <w:szCs w:val="18"/>
-        </w:rPr>
-      </w:pPr>
-      <w:r>
-        <w:rPr>
-          <w:rFonts w:ascii="Verdana" w:eastAsia="굴림" w:hAnsi="Verdana" w:cs="굴림"/>
-          <w:b/>
-          <w:bCs/>
-          <w:color w:val="333333"/>
-          <w:kern w:val="0"/>
-          <w:sz w:val="18"/>
-          <w:szCs w:val="18"/>
-        </w:rPr>
-        <w:t xml:space="preserve">#4. </w:t>
+      <w:bookmarkStart w:id="62" w:name="_Toc28005363"/>
+      <w:r>
+        <w:t xml:space="preserve">HTTPD, Tomcat </w:t>
       </w:r>
       <w:proofErr w:type="spellStart"/>
       <w:r>
         <w:rPr>
-          <w:rFonts w:ascii="Verdana" w:eastAsia="굴림" w:hAnsi="Verdana" w:cs="굴림"/>
-          <w:b/>
-          <w:bCs/>
-          <w:color w:val="333333"/>
-          <w:kern w:val="0"/>
-          <w:sz w:val="18"/>
-          <w:szCs w:val="18"/>
-        </w:rPr>
-        <w:t>JMocha</w:t>
-      </w:r>
-      <w:proofErr w:type="spellEnd"/>
-      <w:r>
-        <w:rPr>
-          <w:rFonts w:ascii="Verdana" w:eastAsia="굴림" w:hAnsi="Verdana" w:cs="굴림"/>
-          <w:b/>
-          <w:bCs/>
-          <w:color w:val="333333"/>
-          <w:kern w:val="0"/>
-          <w:sz w:val="18"/>
-          <w:szCs w:val="18"/>
-        </w:rPr>
-        <w:t xml:space="preserve"> Mail Server </w:t>
-      </w:r>
-      <w:r>
-        <w:rPr>
-          <w:rFonts w:ascii="Verdana" w:eastAsia="굴림" w:hAnsi="Verdana" w:cs="굴림"/>
-          <w:b/>
-          <w:bCs/>
-          <w:color w:val="333333"/>
-          <w:kern w:val="0"/>
-          <w:sz w:val="18"/>
-          <w:szCs w:val="18"/>
-        </w:rPr>
-        <w:t>설치</w:t>
-      </w:r>
-      <w:r>
-        <w:rPr>
-          <w:rFonts w:ascii="Verdana" w:eastAsia="굴림" w:hAnsi="Verdana" w:cs="굴림"/>
-          <w:color w:val="333333"/>
-          <w:kern w:val="0"/>
-          <w:sz w:val="18"/>
-          <w:szCs w:val="18"/>
-        </w:rPr>
-        <w:br/>
-      </w:r>
-      <w:r>
-        <w:rPr>
-          <w:rFonts w:ascii="Verdana" w:eastAsia="굴림" w:hAnsi="Verdana" w:cs="굴림"/>
-          <w:b/>
-          <w:bCs/>
-          <w:color w:val="333333"/>
-          <w:kern w:val="0"/>
-          <w:sz w:val="18"/>
-          <w:szCs w:val="18"/>
-        </w:rPr>
-        <w:br/>
-      </w:r>
-    </w:p>
-    <w:p>
-      <w:pPr>
-        <w:pStyle w:val="a6"/>
-        <w:widowControl/>
-        <w:numPr>
-          <w:ilvl w:val="0"/>
-          <w:numId w:val="15"/>
-        </w:numPr>
-        <w:shd w:val="clear" w:color="auto" w:fill="FFFFFF"/>
-        <w:wordWrap/>
-        <w:autoSpaceDE/>
-        <w:autoSpaceDN/>
-        <w:spacing w:before="100" w:beforeAutospacing="1" w:after="100" w:afterAutospacing="1" w:line="240" w:lineRule="auto"/>
-        <w:ind w:leftChars="0"/>
-        <w:jc w:val="left"/>
-        <w:rPr>
-          <w:rFonts w:ascii="Verdana" w:eastAsia="굴림" w:hAnsi="Verdana" w:cs="굴림"/>
-          <w:color w:val="333333"/>
-          <w:kern w:val="0"/>
-          <w:sz w:val="18"/>
-          <w:szCs w:val="18"/>
-        </w:rPr>
-      </w:pPr>
-      <w:r>
-        <w:rPr>
-          <w:rFonts w:ascii="Verdana" w:eastAsia="굴림" w:hAnsi="Verdana" w:cs="굴림"/>
-          <w:b/>
-          <w:bCs/>
-          <w:color w:val="333333"/>
-          <w:kern w:val="0"/>
-          <w:sz w:val="18"/>
-          <w:szCs w:val="18"/>
-        </w:rPr>
-        <w:t xml:space="preserve">#5. </w:t>
-      </w:r>
-      <w:proofErr w:type="spellStart"/>
-      <w:r>
-        <w:rPr>
-          <w:rFonts w:ascii="Verdana" w:eastAsia="굴림" w:hAnsi="Verdana" w:cs="굴림"/>
-          <w:b/>
-          <w:bCs/>
-          <w:color w:val="333333"/>
-          <w:kern w:val="0"/>
-          <w:sz w:val="18"/>
-          <w:szCs w:val="18"/>
-        </w:rPr>
-        <w:t>ezFlow</w:t>
-      </w:r>
-      <w:proofErr w:type="spellEnd"/>
-      <w:r>
-        <w:rPr>
-          <w:rFonts w:ascii="Verdana" w:eastAsia="굴림" w:hAnsi="Verdana" w:cs="굴림"/>
-          <w:b/>
-          <w:bCs/>
-          <w:color w:val="333333"/>
-          <w:kern w:val="0"/>
-          <w:sz w:val="18"/>
-          <w:szCs w:val="18"/>
-        </w:rPr>
-        <w:t xml:space="preserve"> Server </w:t>
-      </w:r>
-      <w:r>
-        <w:rPr>
-          <w:rFonts w:ascii="Verdana" w:eastAsia="굴림" w:hAnsi="Verdana" w:cs="굴림"/>
-          <w:b/>
-          <w:bCs/>
-          <w:color w:val="333333"/>
-          <w:kern w:val="0"/>
-          <w:sz w:val="18"/>
-          <w:szCs w:val="18"/>
-        </w:rPr>
-        <w:t>설치</w:t>
-      </w:r>
-      <w:r>
-        <w:rPr>
-          <w:rFonts w:ascii="Verdana" w:eastAsia="굴림" w:hAnsi="Verdana" w:cs="굴림"/>
-          <w:b/>
-          <w:bCs/>
-          <w:color w:val="333333"/>
-          <w:kern w:val="0"/>
-          <w:sz w:val="18"/>
-          <w:szCs w:val="18"/>
-        </w:rPr>
-        <w:br/>
-      </w:r>
-      <w:r>
-        <w:rPr>
-          <w:rFonts w:ascii="Verdana" w:eastAsia="굴림" w:hAnsi="Verdana" w:cs="굴림"/>
-          <w:b/>
-          <w:bCs/>
-          <w:color w:val="333333"/>
-          <w:kern w:val="0"/>
-          <w:sz w:val="18"/>
-          <w:szCs w:val="18"/>
-        </w:rPr>
-        <w:br/>
-      </w:r>
-    </w:p>
-    <w:p>
-      <w:pPr>
-        <w:pStyle w:val="a6"/>
-        <w:widowControl/>
-        <w:numPr>
-          <w:ilvl w:val="0"/>
-          <w:numId w:val="15"/>
-        </w:numPr>
-        <w:shd w:val="clear" w:color="auto" w:fill="FFFFFF"/>
-        <w:wordWrap/>
-        <w:autoSpaceDE/>
-        <w:autoSpaceDN/>
-        <w:spacing w:before="100" w:beforeAutospacing="1" w:after="100" w:afterAutospacing="1" w:line="240" w:lineRule="auto"/>
-        <w:ind w:leftChars="0"/>
-        <w:jc w:val="left"/>
-        <w:rPr>
-          <w:rFonts w:ascii="Verdana" w:eastAsia="굴림" w:hAnsi="Verdana" w:cs="굴림"/>
-          <w:color w:val="333333"/>
-          <w:kern w:val="0"/>
-          <w:sz w:val="18"/>
-          <w:szCs w:val="18"/>
-        </w:rPr>
-      </w:pPr>
-      <w:r>
-        <w:rPr>
-          <w:rFonts w:ascii="Verdana" w:eastAsia="굴림" w:hAnsi="Verdana" w:cs="굴림"/>
-          <w:b/>
-          <w:bCs/>
-          <w:color w:val="333333"/>
-          <w:kern w:val="0"/>
-          <w:sz w:val="18"/>
-          <w:szCs w:val="18"/>
-        </w:rPr>
-        <w:lastRenderedPageBreak/>
-        <w:t xml:space="preserve">#6. </w:t>
-      </w:r>
-      <w:r>
-        <w:rPr>
-          <w:rFonts w:ascii="Verdana" w:eastAsia="굴림" w:hAnsi="Verdana" w:cs="굴림"/>
-          <w:b/>
-          <w:bCs/>
-          <w:color w:val="333333"/>
-          <w:kern w:val="0"/>
-          <w:sz w:val="18"/>
-          <w:szCs w:val="18"/>
-        </w:rPr>
-        <w:t>부팅</w:t>
-      </w:r>
-      <w:r>
-        <w:rPr>
-          <w:rFonts w:ascii="Verdana" w:eastAsia="굴림" w:hAnsi="Verdana" w:cs="굴림"/>
-          <w:b/>
-          <w:bCs/>
-          <w:color w:val="333333"/>
-          <w:kern w:val="0"/>
-          <w:sz w:val="18"/>
-          <w:szCs w:val="18"/>
-        </w:rPr>
-        <w:t xml:space="preserve"> </w:t>
-      </w:r>
-      <w:r>
-        <w:rPr>
-          <w:rFonts w:ascii="Verdana" w:eastAsia="굴림" w:hAnsi="Verdana" w:cs="굴림"/>
-          <w:b/>
-          <w:bCs/>
-          <w:color w:val="333333"/>
-          <w:kern w:val="0"/>
-          <w:sz w:val="18"/>
-          <w:szCs w:val="18"/>
-        </w:rPr>
-        <w:t>시</w:t>
-      </w:r>
-      <w:r>
-        <w:rPr>
-          <w:rFonts w:ascii="Verdana" w:eastAsia="굴림" w:hAnsi="Verdana" w:cs="굴림"/>
-          <w:b/>
-          <w:bCs/>
-          <w:color w:val="333333"/>
-          <w:kern w:val="0"/>
-          <w:sz w:val="18"/>
-          <w:szCs w:val="18"/>
-        </w:rPr>
-        <w:t xml:space="preserve"> </w:t>
-      </w:r>
-      <w:r>
-        <w:rPr>
-          <w:rFonts w:ascii="Verdana" w:eastAsia="굴림" w:hAnsi="Verdana" w:cs="굴림"/>
-          <w:b/>
-          <w:bCs/>
-          <w:color w:val="333333"/>
-          <w:kern w:val="0"/>
-          <w:sz w:val="18"/>
-          <w:szCs w:val="18"/>
-        </w:rPr>
-        <w:t>실행</w:t>
-      </w:r>
-      <w:r>
-        <w:rPr>
-          <w:rFonts w:ascii="Verdana" w:eastAsia="굴림" w:hAnsi="Verdana" w:cs="굴림"/>
-          <w:b/>
-          <w:bCs/>
-          <w:color w:val="333333"/>
-          <w:kern w:val="0"/>
-          <w:sz w:val="18"/>
-          <w:szCs w:val="18"/>
-        </w:rPr>
-        <w:t xml:space="preserve"> </w:t>
-      </w:r>
-      <w:r>
-        <w:rPr>
-          <w:rFonts w:ascii="Verdana" w:eastAsia="굴림" w:hAnsi="Verdana" w:cs="굴림"/>
-          <w:b/>
-          <w:bCs/>
-          <w:color w:val="333333"/>
-          <w:kern w:val="0"/>
-          <w:sz w:val="18"/>
-          <w:szCs w:val="18"/>
-        </w:rPr>
-        <w:t>설정</w:t>
-      </w:r>
-      <w:r>
-        <w:rPr>
-          <w:rFonts w:ascii="Verdana" w:eastAsia="굴림" w:hAnsi="Verdana" w:cs="굴림"/>
-          <w:color w:val="333333"/>
-          <w:kern w:val="0"/>
-          <w:sz w:val="18"/>
-          <w:szCs w:val="18"/>
-        </w:rPr>
-        <w:br/>
-      </w:r>
-      <w:r>
-        <w:rPr>
-          <w:noProof/>
-        </w:rPr>
-        <w:drawing>
-          <wp:inline distT="0" distB="0" distL="0" distR="0" wp14:anchorId="056F447A" wp14:editId="18A2A502">
-            <wp:extent cx="8372475" cy="1285875"/>
-            <wp:effectExtent l="0" t="0" r="9525" b="9525"/>
-            <wp:docPr id="76" name="그림 76" descr="http://10.0.140.184:8088/redmine/system/rich/rich_files/rich_files/000/000/137/original/c15.PNG"/>
-            <wp:cNvGraphicFramePr>
-              <a:graphicFrameLocks xmlns:a="http://schemas.openxmlformats.org/drawingml/2006/main" noChangeAspect="1"/>
-            </wp:cNvGraphicFramePr>
-            <a:graphic xmlns:a="http://schemas.openxmlformats.org/drawingml/2006/main">
-              <a:graphicData uri="http://schemas.openxmlformats.org/drawingml/2006/picture">
-                <pic:pic xmlns:pic="http://schemas.openxmlformats.org/drawingml/2006/picture">
-                  <pic:nvPicPr>
-                    <pic:cNvPr id="0" name="Picture 381" descr="http://10.0.140.184:8088/redmine/system/rich/rich_files/rich_files/000/000/137/original/c15.PNG"/>
-                    <pic:cNvPicPr>
-                      <a:picLocks noChangeAspect="1" noChangeArrowheads="1"/>
-                    </pic:cNvPicPr>
-                  </pic:nvPicPr>
-                  <pic:blipFill rotWithShape="1">
-                    <a:blip r:embed="rId35">
-                      <a:extLst>
-                        <a:ext uri="{28A0092B-C50C-407E-A947-70E740481C1C}">
-                          <a14:useLocalDpi xmlns:a14="http://schemas.microsoft.com/office/drawing/2010/main" val="0"/>
-                        </a:ext>
-                      </a:extLst>
-                    </a:blip>
-                    <a:srcRect t="3077" b="27693"/>
-                    <a:stretch/>
-                  </pic:blipFill>
-                  <pic:spPr bwMode="auto">
-                    <a:xfrm>
-                      <a:off x="0" y="0"/>
-                      <a:ext cx="8372475" cy="1285875"/>
-                    </a:xfrm>
-                    <a:prstGeom prst="rect">
-                      <a:avLst/>
-                    </a:prstGeom>
-                    <a:noFill/>
-                    <a:ln>
-                      <a:noFill/>
-                    </a:ln>
-                    <a:extLst>
-                      <a:ext uri="{53640926-AAD7-44D8-BBD7-CCE9431645EC}">
-                        <a14:shadowObscured xmlns:a14="http://schemas.microsoft.com/office/drawing/2010/main"/>
-                      </a:ext>
-                    </a:extLst>
-                  </pic:spPr>
-                </pic:pic>
-              </a:graphicData>
-            </a:graphic>
-          </wp:inline>
-        </w:drawing>
-      </w:r>
-      <w:r>
-        <w:rPr>
-          <w:rFonts w:ascii="Verdana" w:eastAsia="굴림" w:hAnsi="Verdana" w:cs="굴림"/>
-          <w:color w:val="333333"/>
-          <w:kern w:val="0"/>
-          <w:sz w:val="18"/>
-          <w:szCs w:val="18"/>
-        </w:rPr>
-        <w:br/>
-        <w:t> </w:t>
-      </w:r>
-      <w:r>
-        <w:rPr>
-          <w:rFonts w:ascii="Verdana" w:eastAsia="굴림" w:hAnsi="Verdana" w:cs="굴림"/>
-          <w:color w:val="333333"/>
-          <w:kern w:val="0"/>
-          <w:sz w:val="18"/>
-          <w:szCs w:val="18"/>
-        </w:rPr>
-        <w:br/>
-      </w:r>
-    </w:p>
-    <w:p>
-      <w:pPr>
-        <w:pStyle w:val="1"/>
-        <w:numPr>
-          <w:ilvl w:val="1"/>
-          <w:numId w:val="14"/>
-        </w:numPr>
-      </w:pPr>
-      <w:bookmarkStart w:id="63" w:name="_Toc28005363"/>
-      <w:r>
-        <w:t xml:space="preserve">HTTPD, Tomcat </w:t>
-      </w:r>
-      <w:proofErr w:type="spellStart"/>
-      <w:r>
-        <w:rPr>
           <w:rFonts w:hint="eastAsia"/>
         </w:rPr>
         <w:t>재시작</w:t>
       </w:r>
-      <w:bookmarkEnd w:id="63"/>
+      <w:bookmarkEnd w:id="62"/>
       <w:proofErr w:type="spellEnd"/>
     </w:p>
     <w:p>
@@ -17037,15 +15477,6 @@
           <w:szCs w:val="18"/>
         </w:rPr>
         <w:br/>
-      </w:r>
-      <w:r>
-        <w:rPr>
-          <w:rFonts w:ascii="Verdana" w:eastAsia="굴림" w:hAnsi="Verdana" w:cs="굴림"/>
-          <w:color w:val="333333"/>
-          <w:kern w:val="0"/>
-          <w:sz w:val="18"/>
-          <w:szCs w:val="18"/>
-        </w:rPr>
         <w:t>./shutdown.sh;./startup</w:t>
       </w:r>
       <w:r>
@@ -17059,6 +15490,8 @@
         <w:br/>
         <w:t> </w:t>
       </w:r>
+      <w:bookmarkStart w:id="63" w:name="_GoBack"/>
+      <w:bookmarkEnd w:id="63"/>
     </w:p>
     <w:p>
       <w:pPr>
@@ -17405,6 +15838,7 @@
           <w:sz w:val="18"/>
           <w:szCs w:val="18"/>
         </w:rPr>
+        <w:lastRenderedPageBreak/>
         <w:t>ps</w:t>
       </w:r>
       <w:proofErr w:type="spellEnd"/>
@@ -18028,7 +16462,7 @@
         <w:ind w:leftChars="0"/>
         <w:jc w:val="left"/>
         <w:rPr>
-          <w:rFonts w:ascii="Verdana" w:eastAsia="굴림" w:hAnsi="Verdana" w:cs="굴림" w:hint="eastAsia"/>
+          <w:rFonts w:ascii="Verdana" w:eastAsia="굴림" w:hAnsi="Verdana" w:cs="굴림"/>
           <w:color w:val="333333"/>
           <w:kern w:val="0"/>
           <w:sz w:val="18"/>
@@ -18426,7 +16860,7 @@
         <v:path o:extrusionok="f" gradientshapeok="t" o:connecttype="rect"/>
         <o:lock v:ext="edit" aspectratio="t"/>
       </v:shapetype>
-      <v:shape id="_x0000_i1239" type="#_x0000_t75" alt="BD21312_" style="width:11.25pt;height:11.25pt;visibility:visible;mso-wrap-style:square" o:bullet="t">
+      <v:shape id="_x0000_i1033" type="#_x0000_t75" alt="BD21312_" style="width:11.25pt;height:11.25pt;visibility:visible;mso-wrap-style:square" o:bullet="t">
         <v:imagedata r:id="rId1" o:title="BD21312_"/>
       </v:shape>
     </w:pict>
@@ -23683,6 +22117,7 @@
   <w:style w:type="character" w:default="1" w:styleId="a0">
     <w:name w:val="Default Paragraph Font"/>
     <w:uiPriority w:val="1"/>
+    <w:semiHidden/>
     <w:unhideWhenUsed/>
   </w:style>
   <w:style w:type="table" w:default="1" w:styleId="a1">
@@ -24283,7 +22718,7 @@
 </file>
 
 <file path=customXml/itemProps1.xml><?xml version="1.0" encoding="utf-8"?>
-<ds:datastoreItem xmlns:ds="http://schemas.openxmlformats.org/officeDocument/2006/customXml" ds:itemID="{38E8EB2D-3940-48B4-9E81-F1272ECED998}">
+<ds:datastoreItem xmlns:ds="http://schemas.openxmlformats.org/officeDocument/2006/customXml" ds:itemID="{ABAD567C-0ADE-4069-B271-B3A7C3DCD2CB}">
   <ds:schemaRefs>
     <ds:schemaRef ds:uri="http://schemas.openxmlformats.org/officeDocument/2006/bibliography"/>
   </ds:schemaRefs>

</xml_diff>